<commit_message>
Update portfolio theme, layout, and video
</commit_message>
<xml_diff>
--- a/CV_AMNA_2026 - Copy.docx
+++ b/CV_AMNA_2026 - Copy.docx
@@ -2,86 +2,211 @@
 <file path=word/document.xml><?xml version="1.0" encoding="utf-8"?>
 <w:document xmlns:wpc="http://schemas.microsoft.com/office/word/2010/wordprocessingCanvas" xmlns:cx="http://schemas.microsoft.com/office/drawing/2014/chartex" xmlns:mc="http://schemas.openxmlformats.org/markup-compatibility/2006" xmlns:o="urn:schemas-microsoft-com:office:office" xmlns:r="http://schemas.openxmlformats.org/officeDocument/2006/relationships" xmlns:m="http://schemas.openxmlformats.org/officeDocument/2006/math" xmlns:v="urn:schemas-microsoft-com:vml" xmlns:wp14="http://schemas.microsoft.com/office/word/2010/wordprocessingDrawing" xmlns:wp="http://schemas.openxmlformats.org/drawingml/2006/wordprocessingDrawing" xmlns:w10="urn:schemas-microsoft-com:office:word" xmlns:w="http://schemas.openxmlformats.org/wordprocessingml/2006/main" xmlns:w14="http://schemas.microsoft.com/office/word/2010/wordml" xmlns:w15="http://schemas.microsoft.com/office/word/2012/wordml" xmlns:w16se="http://schemas.microsoft.com/office/word/2015/wordml/symex" xmlns:wpg="http://schemas.microsoft.com/office/word/2010/wordprocessingGroup" xmlns:wpi="http://schemas.microsoft.com/office/word/2010/wordprocessingInk" xmlns:wne="http://schemas.microsoft.com/office/word/2006/wordml" xmlns:wps="http://schemas.microsoft.com/office/word/2010/wordprocessingShape" mc:Ignorable="w14 w15 w16se wp14">
   <w:body>
-    <w:p/>
     <w:p>
       <w:pPr>
-        <w:pStyle w:val="Heading1"/>
-      </w:pPr>
-      <w:r>
-        <w:t>Amna Seth</w:t>
-      </w:r>
+        <w:rPr>
+          <w:rFonts w:cstheme="minorHAnsi"/>
+        </w:rPr>
+      </w:pPr>
     </w:p>
     <w:p>
       <w:pPr>
+        <w:pStyle w:val="Heading1"/>
+        <w:rPr>
+          <w:rFonts w:asciiTheme="minorHAnsi" w:hAnsiTheme="minorHAnsi" w:cstheme="minorHAnsi"/>
+        </w:rPr>
+      </w:pPr>
+      <w:r>
+        <w:rPr>
+          <w:rFonts w:asciiTheme="minorHAnsi" w:hAnsiTheme="minorHAnsi" w:cstheme="minorHAnsi"/>
+        </w:rPr>
+        <w:t>Amna Seth</w:t>
+      </w:r>
+    </w:p>
+    <w:p>
+      <w:pPr>
         <w:pStyle w:val="NormalWeb"/>
+        <w:rPr>
+          <w:rFonts w:asciiTheme="minorHAnsi" w:hAnsiTheme="minorHAnsi" w:cstheme="minorHAnsi"/>
+        </w:rPr>
       </w:pPr>
       <w:r>
         <w:rPr>
           <w:rStyle w:val="Strong"/>
+          <w:rFonts w:asciiTheme="minorHAnsi" w:hAnsiTheme="minorHAnsi" w:cstheme="minorHAnsi"/>
         </w:rPr>
         <w:t>Dublin, Ireland</w:t>
       </w:r>
       <w:r>
+        <w:rPr>
+          <w:rFonts w:asciiTheme="minorHAnsi" w:hAnsiTheme="minorHAnsi" w:cstheme="minorHAnsi"/>
+        </w:rPr>
         <w:t xml:space="preserve"> | </w:t>
       </w:r>
       <w:hyperlink r:id="rId7" w:history="1">
         <w:r>
           <w:rPr>
             <w:rStyle w:val="Hyperlink"/>
+            <w:rFonts w:asciiTheme="minorHAnsi" w:hAnsiTheme="minorHAnsi" w:cstheme="minorHAnsi"/>
           </w:rPr>
           <w:t>amnaseth@gmail.com</w:t>
         </w:r>
       </w:hyperlink>
       <w:r>
+        <w:rPr>
+          <w:rFonts w:asciiTheme="minorHAnsi" w:hAnsiTheme="minorHAnsi" w:cstheme="minorHAnsi"/>
+        </w:rPr>
         <w:t xml:space="preserve"> | </w:t>
       </w:r>
       <w:hyperlink r:id="rId8" w:history="1">
         <w:r>
           <w:rPr>
             <w:rStyle w:val="Hyperlink"/>
+            <w:rFonts w:asciiTheme="minorHAnsi" w:hAnsiTheme="minorHAnsi" w:cstheme="minorHAnsi"/>
           </w:rPr>
           <w:t>LinkedIn</w:t>
         </w:r>
       </w:hyperlink>
       <w:r>
+        <w:rPr>
+          <w:rFonts w:asciiTheme="minorHAnsi" w:hAnsiTheme="minorHAnsi" w:cstheme="minorHAnsi"/>
+        </w:rPr>
         <w:t xml:space="preserve"> |</w:t>
+      </w:r>
+      <w:r>
+        <w:rPr>
+          <w:rFonts w:asciiTheme="minorHAnsi" w:hAnsiTheme="minorHAnsi" w:cstheme="minorHAnsi"/>
+        </w:rPr>
+        <w:t xml:space="preserve"> </w:t>
+      </w:r>
+      <w:hyperlink r:id="rId9" w:history="1">
+        <w:r>
+          <w:rPr>
+            <w:rStyle w:val="Hyperlink"/>
+            <w:rFonts w:asciiTheme="minorHAnsi" w:hAnsiTheme="minorHAnsi" w:cstheme="minorHAnsi"/>
+          </w:rPr>
+          <w:t>amna-portfolio</w:t>
+        </w:r>
+        <w:r>
+          <w:rPr>
+            <w:rStyle w:val="Hyperlink"/>
+            <w:rFonts w:asciiTheme="minorHAnsi" w:hAnsiTheme="minorHAnsi" w:cstheme="minorHAnsi"/>
+          </w:rPr>
+          <w:t xml:space="preserve"> </w:t>
+        </w:r>
+      </w:hyperlink>
+      <w:r>
+        <w:rPr>
+          <w:rFonts w:asciiTheme="minorHAnsi" w:hAnsiTheme="minorHAnsi" w:cstheme="minorHAnsi"/>
+        </w:rPr>
+        <w:t xml:space="preserve"> </w:t>
       </w:r>
     </w:p>
     <w:p>
-      <w:r>
+      <w:pPr>
+        <w:rPr>
+          <w:rFonts w:cstheme="minorHAnsi"/>
+        </w:rPr>
+      </w:pPr>
+      <w:r>
+        <w:rPr>
+          <w:rFonts w:cstheme="minorHAnsi"/>
+        </w:rPr>
         <w:pict>
-          <v:rect id="_x0000_i1038" style="width:0;height:1.5pt" o:hralign="center" o:hrstd="t" o:hr="t" fillcolor="#a0a0a0" stroked="f"/>
+          <v:rect id="_x0000_i1025" style="width:0;height:1.5pt" o:hralign="center" o:hrstd="t" o:hr="t" fillcolor="#a0a0a0" stroked="f"/>
         </w:pict>
       </w:r>
     </w:p>
     <w:p>
       <w:pPr>
         <w:pStyle w:val="Heading2"/>
-      </w:pPr>
-      <w:r>
+        <w:rPr>
+          <w:rFonts w:asciiTheme="minorHAnsi" w:hAnsiTheme="minorHAnsi" w:cstheme="minorHAnsi"/>
+        </w:rPr>
+      </w:pPr>
+      <w:r>
+        <w:rPr>
+          <w:rFonts w:asciiTheme="minorHAnsi" w:hAnsiTheme="minorHAnsi" w:cstheme="minorHAnsi"/>
+        </w:rPr>
         <w:t>PROFESSIONAL SUMMARY</w:t>
       </w:r>
     </w:p>
     <w:p>
       <w:pPr>
         <w:pStyle w:val="NormalWeb"/>
-      </w:pPr>
-      <w:r>
-        <w:t>UX/UI and Digital Media Designer with over 5 years of experience architecting inclusive, human-centered digital products for NGOs, tech firms, and corporate enterprises. Currently advancing expertise through an MA in Interactive Digital Media at Trinity College Dublin (2025–2026). Expert in leveraging design thinking, deep UX research, and agile prototyping to solve complex user problems. Uniquely pairs aesthetic interface design with hands-on front-end development skills (HTML, CSS, JavaScript) to deliver functional, highly accessible, and technically feasible digital solutions that drive engagement and business value.</w:t>
+        <w:rPr>
+          <w:rFonts w:asciiTheme="minorHAnsi" w:hAnsiTheme="minorHAnsi" w:cstheme="minorHAnsi"/>
+        </w:rPr>
+      </w:pPr>
+      <w:r>
+        <w:rPr>
+          <w:rFonts w:asciiTheme="minorHAnsi" w:hAnsiTheme="minorHAnsi" w:cstheme="minorHAnsi"/>
+        </w:rPr>
+        <w:t>UX/UI and Digital Media Designer with over 5 years of experience creating inclusive, human-</w:t>
+      </w:r>
+      <w:r>
+        <w:rPr>
+          <w:rFonts w:asciiTheme="minorHAnsi" w:hAnsiTheme="minorHAnsi" w:cstheme="minorHAnsi"/>
+        </w:rPr>
+        <w:t>centred</w:t>
+      </w:r>
+      <w:r>
+        <w:rPr>
+          <w:rFonts w:asciiTheme="minorHAnsi" w:hAnsiTheme="minorHAnsi" w:cstheme="minorHAnsi"/>
+        </w:rPr>
+        <w:t xml:space="preserve"> digital products for NGOs, tech firms, and corporate enterprises. Currently pursuing an MA in Interactive Digital Media at Trinity College Dublin (2025–2026). Skilled in design thinking, UX research, agile prototyping, and front-end development (HTML, CSS, JavaScript) to deliver </w:t>
+      </w:r>
+      <w:r>
+        <w:rPr>
+          <w:rFonts w:asciiTheme="minorHAnsi" w:hAnsiTheme="minorHAnsi" w:cstheme="minorHAnsi"/>
+        </w:rPr>
+        <w:t xml:space="preserve">within a cross – </w:t>
+      </w:r>
+      <w:r>
+        <w:rPr>
+          <w:rFonts w:asciiTheme="minorHAnsi" w:hAnsiTheme="minorHAnsi" w:cstheme="minorHAnsi"/>
+        </w:rPr>
+        <w:t>functional</w:t>
+      </w:r>
+      <w:r>
+        <w:rPr>
+          <w:rFonts w:asciiTheme="minorHAnsi" w:hAnsiTheme="minorHAnsi" w:cstheme="minorHAnsi"/>
+        </w:rPr>
+        <w:t xml:space="preserve"> team</w:t>
+      </w:r>
+      <w:r>
+        <w:rPr>
+          <w:rFonts w:asciiTheme="minorHAnsi" w:hAnsiTheme="minorHAnsi" w:cstheme="minorHAnsi"/>
+        </w:rPr>
+        <w:t>, accessible digital solutions.</w:t>
       </w:r>
     </w:p>
     <w:p>
-      <w:r>
+      <w:pPr>
+        <w:rPr>
+          <w:rFonts w:cstheme="minorHAnsi"/>
+        </w:rPr>
+      </w:pPr>
+      <w:r>
+        <w:rPr>
+          <w:rFonts w:cstheme="minorHAnsi"/>
+        </w:rPr>
         <w:pict>
-          <v:rect id="_x0000_i1039" style="width:0;height:1.5pt" o:hralign="center" o:hrstd="t" o:hr="t" fillcolor="#a0a0a0" stroked="f"/>
+          <v:rect id="_x0000_i1026" style="width:0;height:1.5pt" o:hralign="center" o:hrstd="t" o:hr="t" fillcolor="#a0a0a0" stroked="f"/>
         </w:pict>
       </w:r>
     </w:p>
     <w:p>
       <w:pPr>
         <w:pStyle w:val="Heading2"/>
-      </w:pPr>
-      <w:r>
+        <w:rPr>
+          <w:rFonts w:asciiTheme="minorHAnsi" w:hAnsiTheme="minorHAnsi" w:cstheme="minorHAnsi"/>
+        </w:rPr>
+      </w:pPr>
+      <w:r>
+        <w:rPr>
+          <w:rFonts w:asciiTheme="minorHAnsi" w:hAnsiTheme="minorHAnsi" w:cstheme="minorHAnsi"/>
+        </w:rPr>
         <w:t>CORE COMPETENCIES &amp; TECHNICAL SKILLS</w:t>
       </w:r>
     </w:p>
@@ -90,17 +215,38 @@
         <w:pStyle w:val="NormalWeb"/>
         <w:numPr>
           <w:ilvl w:val="0"/>
-          <w:numId w:val="8"/>
+          <w:numId w:val="15"/>
         </w:numPr>
+        <w:rPr>
+          <w:rFonts w:asciiTheme="minorHAnsi" w:hAnsiTheme="minorHAnsi" w:cstheme="minorHAnsi"/>
+        </w:rPr>
       </w:pPr>
       <w:r>
         <w:rPr>
           <w:rStyle w:val="Strong"/>
-        </w:rPr>
-        <w:t>Design &amp; UX Methods:</w:t>
-      </w:r>
-      <w:r>
-        <w:t xml:space="preserve"> Design Thinking, Deep User Research, Usability Testing, Wireframing, Rapid Prototyping, Interaction Design, User Journey Mapping, Information Architecture.</w:t>
+          <w:rFonts w:asciiTheme="minorHAnsi" w:hAnsiTheme="minorHAnsi" w:cstheme="minorHAnsi"/>
+        </w:rPr>
+        <w:t>Design &amp; UX Methods</w:t>
+      </w:r>
+      <w:r>
+        <w:rPr>
+          <w:rStyle w:val="Strong"/>
+          <w:rFonts w:asciiTheme="minorHAnsi" w:hAnsiTheme="minorHAnsi" w:cstheme="minorHAnsi"/>
+        </w:rPr>
+        <w:t xml:space="preserve"> Project Management</w:t>
+      </w:r>
+      <w:r>
+        <w:rPr>
+          <w:rStyle w:val="Strong"/>
+          <w:rFonts w:asciiTheme="minorHAnsi" w:hAnsiTheme="minorHAnsi" w:cstheme="minorHAnsi"/>
+        </w:rPr>
+        <w:t>:</w:t>
+      </w:r>
+      <w:r>
+        <w:rPr>
+          <w:rFonts w:asciiTheme="minorHAnsi" w:hAnsiTheme="minorHAnsi" w:cstheme="minorHAnsi"/>
+        </w:rPr>
+        <w:t xml:space="preserve"> Design Thinking, User Research, Usability Testing, Wireframing, Prototyping, Interaction Design, User Journey Mapping, Information Architecture.</w:t>
       </w:r>
     </w:p>
     <w:p>
@@ -108,17 +254,24 @@
         <w:pStyle w:val="NormalWeb"/>
         <w:numPr>
           <w:ilvl w:val="0"/>
-          <w:numId w:val="8"/>
+          <w:numId w:val="15"/>
         </w:numPr>
+        <w:rPr>
+          <w:rFonts w:asciiTheme="minorHAnsi" w:hAnsiTheme="minorHAnsi" w:cstheme="minorHAnsi"/>
+        </w:rPr>
       </w:pPr>
       <w:r>
         <w:rPr>
           <w:rStyle w:val="Strong"/>
+          <w:rFonts w:asciiTheme="minorHAnsi" w:hAnsiTheme="minorHAnsi" w:cstheme="minorHAnsi"/>
         </w:rPr>
         <w:t>Digital Product Development:</w:t>
       </w:r>
       <w:r>
-        <w:t xml:space="preserve"> Mobile &amp; Web App Design, WCAG Accessibility Standards, Feature Ideation, Iterative A/B Testing, Product Lifecycle Maintenance, Front-End Development (HTML5, CSS3, JavaScript).</w:t>
+        <w:rPr>
+          <w:rFonts w:asciiTheme="minorHAnsi" w:hAnsiTheme="minorHAnsi" w:cstheme="minorHAnsi"/>
+        </w:rPr>
+        <w:t xml:space="preserve"> Mobile &amp; Web App Design, WCAG Accessibility Standards, Feature Ideation, A/B Testing, Product Lifecycle, Front-End Development (HTML5, CSS3, JavaScript).</w:t>
       </w:r>
     </w:p>
     <w:p>
@@ -126,22 +279,24 @@
         <w:pStyle w:val="NormalWeb"/>
         <w:numPr>
           <w:ilvl w:val="0"/>
-          <w:numId w:val="8"/>
+          <w:numId w:val="15"/>
         </w:numPr>
+        <w:rPr>
+          <w:rFonts w:asciiTheme="minorHAnsi" w:hAnsiTheme="minorHAnsi" w:cstheme="minorHAnsi"/>
+        </w:rPr>
       </w:pPr>
       <w:r>
         <w:rPr>
           <w:rStyle w:val="Strong"/>
+          <w:rFonts w:asciiTheme="minorHAnsi" w:hAnsiTheme="minorHAnsi" w:cstheme="minorHAnsi"/>
         </w:rPr>
         <w:t>Tools &amp; Software:</w:t>
       </w:r>
       <w:r>
-        <w:t xml:space="preserve"> Figma, FigJam, Adobe Creative Suite, </w:t>
-      </w:r>
-      <w:bookmarkStart w:id="0" w:name="_GoBack"/>
-      <w:bookmarkEnd w:id="0"/>
-      <w:r>
-        <w:t>Sketch, Webflow, Miro, Jira, GitHub.</w:t>
+        <w:rPr>
+          <w:rFonts w:asciiTheme="minorHAnsi" w:hAnsiTheme="minorHAnsi" w:cstheme="minorHAnsi"/>
+        </w:rPr>
+        <w:t xml:space="preserve"> Figma, FigJam, Adobe Creative Suite, Sketch, Webflow, Miro, Jira, GitHub.</w:t>
       </w:r>
     </w:p>
     <w:p>
@@ -149,57 +304,92 @@
         <w:pStyle w:val="NormalWeb"/>
         <w:numPr>
           <w:ilvl w:val="0"/>
-          <w:numId w:val="8"/>
+          <w:numId w:val="15"/>
         </w:numPr>
+        <w:rPr>
+          <w:rFonts w:asciiTheme="minorHAnsi" w:hAnsiTheme="minorHAnsi" w:cstheme="minorHAnsi"/>
+        </w:rPr>
       </w:pPr>
       <w:r>
         <w:rPr>
           <w:rStyle w:val="Strong"/>
+          <w:rFonts w:asciiTheme="minorHAnsi" w:hAnsiTheme="minorHAnsi" w:cstheme="minorHAnsi"/>
         </w:rPr>
         <w:t>Leadership &amp; Strategy:</w:t>
       </w:r>
       <w:r>
+        <w:rPr>
+          <w:rFonts w:asciiTheme="minorHAnsi" w:hAnsiTheme="minorHAnsi" w:cstheme="minorHAnsi"/>
+        </w:rPr>
         <w:t xml:space="preserve"> Cross-Functional Collaboration, Stakeholder Management, Client Presentations, Inclusive Communication, Strategic Design Consultancy.</w:t>
       </w:r>
     </w:p>
     <w:p>
-      <w:r>
+      <w:pPr>
+        <w:rPr>
+          <w:rFonts w:cstheme="minorHAnsi"/>
+        </w:rPr>
+      </w:pPr>
+      <w:r>
+        <w:rPr>
+          <w:rFonts w:cstheme="minorHAnsi"/>
+        </w:rPr>
         <w:pict>
-          <v:rect id="_x0000_i1040" style="width:0;height:1.5pt" o:hralign="center" o:hrstd="t" o:hr="t" fillcolor="#a0a0a0" stroked="f"/>
+          <v:rect id="_x0000_i1027" style="width:0;height:1.5pt" o:hralign="center" o:hrstd="t" o:hr="t" fillcolor="#a0a0a0" stroked="f"/>
         </w:pict>
       </w:r>
     </w:p>
     <w:p>
       <w:pPr>
         <w:pStyle w:val="Heading2"/>
-      </w:pPr>
-      <w:r>
+        <w:rPr>
+          <w:rFonts w:asciiTheme="minorHAnsi" w:hAnsiTheme="minorHAnsi" w:cstheme="minorHAnsi"/>
+        </w:rPr>
+      </w:pPr>
+      <w:r>
+        <w:rPr>
+          <w:rFonts w:asciiTheme="minorHAnsi" w:hAnsiTheme="minorHAnsi" w:cstheme="minorHAnsi"/>
+        </w:rPr>
         <w:t>PROFESSIONAL EXPERIENCE</w:t>
       </w:r>
     </w:p>
     <w:p>
       <w:pPr>
         <w:pStyle w:val="NormalWeb"/>
+        <w:rPr>
+          <w:rFonts w:asciiTheme="minorHAnsi" w:hAnsiTheme="minorHAnsi" w:cstheme="minorHAnsi"/>
+        </w:rPr>
       </w:pPr>
       <w:r>
         <w:rPr>
           <w:rStyle w:val="Strong"/>
+          <w:rFonts w:asciiTheme="minorHAnsi" w:hAnsiTheme="minorHAnsi" w:cstheme="minorHAnsi"/>
         </w:rPr>
         <w:t>Saksham Trust</w:t>
       </w:r>
       <w:r>
+        <w:rPr>
+          <w:rFonts w:asciiTheme="minorHAnsi" w:hAnsiTheme="minorHAnsi" w:cstheme="minorHAnsi"/>
+        </w:rPr>
         <w:t xml:space="preserve"> | New Delhi, India</w:t>
       </w:r>
       <w:r>
+        <w:rPr>
+          <w:rFonts w:asciiTheme="minorHAnsi" w:hAnsiTheme="minorHAnsi" w:cstheme="minorHAnsi"/>
+        </w:rPr>
         <w:br/>
       </w:r>
       <w:r>
         <w:rPr>
           <w:rStyle w:val="Emphasis"/>
+          <w:rFonts w:asciiTheme="minorHAnsi" w:hAnsiTheme="minorHAnsi" w:cstheme="minorHAnsi"/>
         </w:rPr>
         <w:t>Associate Design Consultant</w:t>
       </w:r>
       <w:r>
+        <w:rPr>
+          <w:rFonts w:asciiTheme="minorHAnsi" w:hAnsiTheme="minorHAnsi" w:cstheme="minorHAnsi"/>
+        </w:rPr>
         <w:t xml:space="preserve"> | Nov 2023 – Jun 2025</w:t>
       </w:r>
     </w:p>
@@ -208,11 +398,17 @@
         <w:pStyle w:val="NormalWeb"/>
         <w:numPr>
           <w:ilvl w:val="0"/>
-          <w:numId w:val="9"/>
+          <w:numId w:val="16"/>
         </w:numPr>
-      </w:pPr>
-      <w:r>
-        <w:t>Spearheaded Accessible Product Design: Led the end-to-end UX/UI development of a specialized mobile application for visually impaired users.</w:t>
+        <w:rPr>
+          <w:rFonts w:asciiTheme="minorHAnsi" w:hAnsiTheme="minorHAnsi" w:cstheme="minorHAnsi"/>
+        </w:rPr>
+      </w:pPr>
+      <w:r>
+        <w:rPr>
+          <w:rFonts w:asciiTheme="minorHAnsi" w:hAnsiTheme="minorHAnsi" w:cstheme="minorHAnsi"/>
+        </w:rPr>
+        <w:t>Led end-to-end UX/UI development of a mobile app for visually impaired users.</w:t>
       </w:r>
     </w:p>
     <w:p>
@@ -220,11 +416,17 @@
         <w:pStyle w:val="NormalWeb"/>
         <w:numPr>
           <w:ilvl w:val="0"/>
-          <w:numId w:val="9"/>
+          <w:numId w:val="16"/>
         </w:numPr>
-      </w:pPr>
-      <w:r>
-        <w:t>Bridged Design &amp; Engineering: Executed full life-cycle processes, bridging design thinking and implementation with front-end coding (HTML, CSS, JavaScript).</w:t>
+        <w:rPr>
+          <w:rFonts w:asciiTheme="minorHAnsi" w:hAnsiTheme="minorHAnsi" w:cstheme="minorHAnsi"/>
+        </w:rPr>
+      </w:pPr>
+      <w:r>
+        <w:rPr>
+          <w:rFonts w:asciiTheme="minorHAnsi" w:hAnsiTheme="minorHAnsi" w:cstheme="minorHAnsi"/>
+        </w:rPr>
+        <w:t>Bridged design and engineering using front-end coding (HTML, CSS, JavaScript).</w:t>
       </w:r>
     </w:p>
     <w:p>
@@ -232,11 +434,17 @@
         <w:pStyle w:val="NormalWeb"/>
         <w:numPr>
           <w:ilvl w:val="0"/>
-          <w:numId w:val="9"/>
+          <w:numId w:val="16"/>
         </w:numPr>
-      </w:pPr>
-      <w:r>
-        <w:t>User-Centric Optimization: Directed extensive user research and usability testing cycles, rapidly iterating on features.</w:t>
+        <w:rPr>
+          <w:rFonts w:asciiTheme="minorHAnsi" w:hAnsiTheme="minorHAnsi" w:cstheme="minorHAnsi"/>
+        </w:rPr>
+      </w:pPr>
+      <w:r>
+        <w:rPr>
+          <w:rFonts w:asciiTheme="minorHAnsi" w:hAnsiTheme="minorHAnsi" w:cstheme="minorHAnsi"/>
+        </w:rPr>
+        <w:t>Conducted user research and usability testing to optimize user flows.</w:t>
       </w:r>
     </w:p>
     <w:p>
@@ -244,12 +452,17 @@
         <w:pStyle w:val="NormalWeb"/>
         <w:numPr>
           <w:ilvl w:val="0"/>
-          <w:numId w:val="9"/>
+          <w:numId w:val="16"/>
         </w:numPr>
-      </w:pPr>
-      <w:r>
-        <w:lastRenderedPageBreak/>
-        <w:t>Stakeholder Alignment: Managed holistic design strategies and collaborated with stakeholders to meet milestones and accessibility standards.</w:t>
+        <w:rPr>
+          <w:rFonts w:asciiTheme="minorHAnsi" w:hAnsiTheme="minorHAnsi" w:cstheme="minorHAnsi"/>
+        </w:rPr>
+      </w:pPr>
+      <w:r>
+        <w:rPr>
+          <w:rFonts w:asciiTheme="minorHAnsi" w:hAnsiTheme="minorHAnsi" w:cstheme="minorHAnsi"/>
+        </w:rPr>
+        <w:t>Managed design strategies and stakeholder collaboration for accessibility compliance.</w:t>
       </w:r>
     </w:p>
     <w:p>
@@ -257,36 +470,57 @@
         <w:pStyle w:val="NormalWeb"/>
         <w:numPr>
           <w:ilvl w:val="0"/>
-          <w:numId w:val="9"/>
+          <w:numId w:val="16"/>
         </w:numPr>
-      </w:pPr>
-      <w:r>
-        <w:t>Platform Enhancement: Maintained and modernized digital platforms, improving user satisfaction metrics.</w:t>
+        <w:rPr>
+          <w:rFonts w:asciiTheme="minorHAnsi" w:hAnsiTheme="minorHAnsi" w:cstheme="minorHAnsi"/>
+        </w:rPr>
+      </w:pPr>
+      <w:r>
+        <w:rPr>
+          <w:rFonts w:asciiTheme="minorHAnsi" w:hAnsiTheme="minorHAnsi" w:cstheme="minorHAnsi"/>
+        </w:rPr>
+        <w:t>Maintained and updated digital platforms to improve user satisfaction.</w:t>
       </w:r>
     </w:p>
     <w:p>
       <w:pPr>
         <w:pStyle w:val="NormalWeb"/>
+        <w:rPr>
+          <w:rFonts w:asciiTheme="minorHAnsi" w:hAnsiTheme="minorHAnsi" w:cstheme="minorHAnsi"/>
+        </w:rPr>
       </w:pPr>
       <w:r>
         <w:rPr>
           <w:rStyle w:val="Strong"/>
-        </w:rPr>
+          <w:rFonts w:asciiTheme="minorHAnsi" w:hAnsiTheme="minorHAnsi" w:cstheme="minorHAnsi"/>
+        </w:rPr>
+        <w:lastRenderedPageBreak/>
         <w:t>Steinbach &amp; Partner</w:t>
       </w:r>
       <w:r>
+        <w:rPr>
+          <w:rFonts w:asciiTheme="minorHAnsi" w:hAnsiTheme="minorHAnsi" w:cstheme="minorHAnsi"/>
+        </w:rPr>
         <w:t xml:space="preserve"> | Pune, India</w:t>
       </w:r>
       <w:r>
+        <w:rPr>
+          <w:rFonts w:asciiTheme="minorHAnsi" w:hAnsiTheme="minorHAnsi" w:cstheme="minorHAnsi"/>
+        </w:rPr>
         <w:br/>
       </w:r>
       <w:r>
         <w:rPr>
           <w:rStyle w:val="Emphasis"/>
+          <w:rFonts w:asciiTheme="minorHAnsi" w:hAnsiTheme="minorHAnsi" w:cstheme="minorHAnsi"/>
         </w:rPr>
         <w:t>Associate Vice President</w:t>
       </w:r>
       <w:r>
+        <w:rPr>
+          <w:rFonts w:asciiTheme="minorHAnsi" w:hAnsiTheme="minorHAnsi" w:cstheme="minorHAnsi"/>
+        </w:rPr>
         <w:t xml:space="preserve"> | Jun 2022 – Oct 2022</w:t>
       </w:r>
     </w:p>
@@ -295,11 +529,17 @@
         <w:pStyle w:val="NormalWeb"/>
         <w:numPr>
           <w:ilvl w:val="0"/>
-          <w:numId w:val="10"/>
+          <w:numId w:val="17"/>
         </w:numPr>
-      </w:pPr>
-      <w:r>
-        <w:t>Digital Presence Management: Directed the visual identity and technical upkeep of the corporate website.</w:t>
+        <w:rPr>
+          <w:rFonts w:asciiTheme="minorHAnsi" w:hAnsiTheme="minorHAnsi" w:cstheme="minorHAnsi"/>
+        </w:rPr>
+      </w:pPr>
+      <w:r>
+        <w:rPr>
+          <w:rFonts w:asciiTheme="minorHAnsi" w:hAnsiTheme="minorHAnsi" w:cstheme="minorHAnsi"/>
+        </w:rPr>
+        <w:t>Managed corporate website design and technical upkeep.</w:t>
       </w:r>
     </w:p>
     <w:p>
@@ -307,11 +547,17 @@
         <w:pStyle w:val="NormalWeb"/>
         <w:numPr>
           <w:ilvl w:val="0"/>
-          <w:numId w:val="10"/>
+          <w:numId w:val="17"/>
         </w:numPr>
-      </w:pPr>
-      <w:r>
-        <w:t>Strategic Deliverables: Authored innovative design solutions and front-end adjustments.</w:t>
+        <w:rPr>
+          <w:rFonts w:asciiTheme="minorHAnsi" w:hAnsiTheme="minorHAnsi" w:cstheme="minorHAnsi"/>
+        </w:rPr>
+      </w:pPr>
+      <w:r>
+        <w:rPr>
+          <w:rFonts w:asciiTheme="minorHAnsi" w:hAnsiTheme="minorHAnsi" w:cstheme="minorHAnsi"/>
+        </w:rPr>
+        <w:t>Delivered front-end adjustments and innovative design solutions.</w:t>
       </w:r>
     </w:p>
     <w:p>
@@ -319,36 +565,56 @@
         <w:pStyle w:val="NormalWeb"/>
         <w:numPr>
           <w:ilvl w:val="0"/>
-          <w:numId w:val="10"/>
+          <w:numId w:val="17"/>
         </w:numPr>
-      </w:pPr>
-      <w:r>
-        <w:t>Design Consultancy: Provided high-level consultative insights to executive leadership.</w:t>
+        <w:rPr>
+          <w:rFonts w:asciiTheme="minorHAnsi" w:hAnsiTheme="minorHAnsi" w:cstheme="minorHAnsi"/>
+        </w:rPr>
+      </w:pPr>
+      <w:r>
+        <w:rPr>
+          <w:rFonts w:asciiTheme="minorHAnsi" w:hAnsiTheme="minorHAnsi" w:cstheme="minorHAnsi"/>
+        </w:rPr>
+        <w:t>Provided strategic design consultancy to executive leadership.</w:t>
       </w:r>
     </w:p>
     <w:p>
       <w:pPr>
         <w:pStyle w:val="NormalWeb"/>
+        <w:rPr>
+          <w:rFonts w:asciiTheme="minorHAnsi" w:hAnsiTheme="minorHAnsi" w:cstheme="minorHAnsi"/>
+        </w:rPr>
       </w:pPr>
       <w:r>
         <w:rPr>
           <w:rStyle w:val="Strong"/>
+          <w:rFonts w:asciiTheme="minorHAnsi" w:hAnsiTheme="minorHAnsi" w:cstheme="minorHAnsi"/>
         </w:rPr>
         <w:t>Nihilent Technologies Pvt. Ltd</w:t>
       </w:r>
       <w:r>
+        <w:rPr>
+          <w:rFonts w:asciiTheme="minorHAnsi" w:hAnsiTheme="minorHAnsi" w:cstheme="minorHAnsi"/>
+        </w:rPr>
         <w:t xml:space="preserve"> | Pune, India</w:t>
       </w:r>
       <w:r>
+        <w:rPr>
+          <w:rFonts w:asciiTheme="minorHAnsi" w:hAnsiTheme="minorHAnsi" w:cstheme="minorHAnsi"/>
+        </w:rPr>
         <w:br/>
       </w:r>
       <w:r>
         <w:rPr>
           <w:rStyle w:val="Emphasis"/>
+          <w:rFonts w:asciiTheme="minorHAnsi" w:hAnsiTheme="minorHAnsi" w:cstheme="minorHAnsi"/>
         </w:rPr>
         <w:t>Associate Consultant</w:t>
       </w:r>
       <w:r>
+        <w:rPr>
+          <w:rFonts w:asciiTheme="minorHAnsi" w:hAnsiTheme="minorHAnsi" w:cstheme="minorHAnsi"/>
+        </w:rPr>
         <w:t xml:space="preserve"> | Jun 2018 – Jun 2022</w:t>
       </w:r>
     </w:p>
@@ -357,11 +623,17 @@
         <w:pStyle w:val="NormalWeb"/>
         <w:numPr>
           <w:ilvl w:val="0"/>
-          <w:numId w:val="11"/>
+          <w:numId w:val="18"/>
         </w:numPr>
-      </w:pPr>
-      <w:r>
-        <w:t>Enterprise UI/UX Design: Architected high-fidelity UI/UX prototypes for enterprise applications in FMCG and banking.</w:t>
+        <w:rPr>
+          <w:rFonts w:asciiTheme="minorHAnsi" w:hAnsiTheme="minorHAnsi" w:cstheme="minorHAnsi"/>
+        </w:rPr>
+      </w:pPr>
+      <w:r>
+        <w:rPr>
+          <w:rFonts w:asciiTheme="minorHAnsi" w:hAnsiTheme="minorHAnsi" w:cstheme="minorHAnsi"/>
+        </w:rPr>
+        <w:t>Created high-fidelity UI/UX prototypes for enterprise applications.</w:t>
       </w:r>
     </w:p>
     <w:p>
@@ -369,11 +641,17 @@
         <w:pStyle w:val="NormalWeb"/>
         <w:numPr>
           <w:ilvl w:val="0"/>
-          <w:numId w:val="11"/>
+          <w:numId w:val="18"/>
         </w:numPr>
-      </w:pPr>
-      <w:r>
-        <w:t>Functional Mockups: Developed interactive front-end mockups using HTML and CSS.</w:t>
+        <w:rPr>
+          <w:rFonts w:asciiTheme="minorHAnsi" w:hAnsiTheme="minorHAnsi" w:cstheme="minorHAnsi"/>
+        </w:rPr>
+      </w:pPr>
+      <w:r>
+        <w:rPr>
+          <w:rFonts w:asciiTheme="minorHAnsi" w:hAnsiTheme="minorHAnsi" w:cstheme="minorHAnsi"/>
+        </w:rPr>
+        <w:t>Developed interactive front-end mockups using HTML and CSS.</w:t>
       </w:r>
     </w:p>
     <w:p>
@@ -381,11 +659,17 @@
         <w:pStyle w:val="NormalWeb"/>
         <w:numPr>
           <w:ilvl w:val="0"/>
-          <w:numId w:val="11"/>
+          <w:numId w:val="18"/>
         </w:numPr>
-      </w:pPr>
-      <w:r>
-        <w:t>Data-Driven Iteration: Conducted A/B testing and user feedback sessions.</w:t>
+        <w:rPr>
+          <w:rFonts w:asciiTheme="minorHAnsi" w:hAnsiTheme="minorHAnsi" w:cstheme="minorHAnsi"/>
+        </w:rPr>
+      </w:pPr>
+      <w:r>
+        <w:rPr>
+          <w:rFonts w:asciiTheme="minorHAnsi" w:hAnsiTheme="minorHAnsi" w:cstheme="minorHAnsi"/>
+        </w:rPr>
+        <w:t>Conducted A/B testing and user feedback sessions.</w:t>
       </w:r>
     </w:p>
     <w:p>
@@ -393,11 +677,17 @@
         <w:pStyle w:val="NormalWeb"/>
         <w:numPr>
           <w:ilvl w:val="0"/>
-          <w:numId w:val="11"/>
+          <w:numId w:val="18"/>
         </w:numPr>
-      </w:pPr>
-      <w:r>
-        <w:t>Strategic Communication: Presented design deliverables to key stakeholders.</w:t>
+        <w:rPr>
+          <w:rFonts w:asciiTheme="minorHAnsi" w:hAnsiTheme="minorHAnsi" w:cstheme="minorHAnsi"/>
+        </w:rPr>
+      </w:pPr>
+      <w:r>
+        <w:rPr>
+          <w:rFonts w:asciiTheme="minorHAnsi" w:hAnsiTheme="minorHAnsi" w:cstheme="minorHAnsi"/>
+        </w:rPr>
+        <w:t>Presented design solutions to stakeholders.</w:t>
       </w:r>
     </w:p>
     <w:p>
@@ -405,25 +695,45 @@
         <w:pStyle w:val="NormalWeb"/>
         <w:numPr>
           <w:ilvl w:val="0"/>
-          <w:numId w:val="11"/>
+          <w:numId w:val="18"/>
         </w:numPr>
-      </w:pPr>
-      <w:r>
-        <w:t>Corporate Branding: Revamped internal and external client-facing web properties.</w:t>
+        <w:rPr>
+          <w:rFonts w:asciiTheme="minorHAnsi" w:hAnsiTheme="minorHAnsi" w:cstheme="minorHAnsi"/>
+        </w:rPr>
+      </w:pPr>
+      <w:r>
+        <w:rPr>
+          <w:rFonts w:asciiTheme="minorHAnsi" w:hAnsiTheme="minorHAnsi" w:cstheme="minorHAnsi"/>
+        </w:rPr>
+        <w:t>Revamped web properties to enhance visual appeal and usability.</w:t>
       </w:r>
     </w:p>
     <w:p>
-      <w:r>
+      <w:pPr>
+        <w:rPr>
+          <w:rFonts w:cstheme="minorHAnsi"/>
+        </w:rPr>
+      </w:pPr>
+      <w:r>
+        <w:rPr>
+          <w:rFonts w:cstheme="minorHAnsi"/>
+        </w:rPr>
         <w:pict>
-          <v:rect id="_x0000_i1041" style="width:0;height:1.5pt" o:hralign="center" o:hrstd="t" o:hr="t" fillcolor="#a0a0a0" stroked="f"/>
+          <v:rect id="_x0000_i1028" style="width:0;height:1.5pt" o:hralign="center" o:hrstd="t" o:hr="t" fillcolor="#a0a0a0" stroked="f"/>
         </w:pict>
       </w:r>
     </w:p>
     <w:p>
       <w:pPr>
         <w:pStyle w:val="Heading2"/>
-      </w:pPr>
-      <w:r>
+        <w:rPr>
+          <w:rFonts w:asciiTheme="minorHAnsi" w:hAnsiTheme="minorHAnsi" w:cstheme="minorHAnsi"/>
+        </w:rPr>
+      </w:pPr>
+      <w:r>
+        <w:rPr>
+          <w:rFonts w:asciiTheme="minorHAnsi" w:hAnsiTheme="minorHAnsi" w:cstheme="minorHAnsi"/>
+        </w:rPr>
         <w:t>EDUCATION</w:t>
       </w:r>
     </w:p>
@@ -432,16 +742,23 @@
         <w:pStyle w:val="NormalWeb"/>
         <w:numPr>
           <w:ilvl w:val="0"/>
-          <w:numId w:val="12"/>
+          <w:numId w:val="19"/>
         </w:numPr>
+        <w:rPr>
+          <w:rFonts w:asciiTheme="minorHAnsi" w:hAnsiTheme="minorHAnsi" w:cstheme="minorHAnsi"/>
+        </w:rPr>
       </w:pPr>
       <w:r>
         <w:rPr>
           <w:rStyle w:val="Strong"/>
+          <w:rFonts w:asciiTheme="minorHAnsi" w:hAnsiTheme="minorHAnsi" w:cstheme="minorHAnsi"/>
         </w:rPr>
         <w:t>MA Interactive Digital Media</w:t>
       </w:r>
       <w:r>
+        <w:rPr>
+          <w:rFonts w:asciiTheme="minorHAnsi" w:hAnsiTheme="minorHAnsi" w:cstheme="minorHAnsi"/>
+        </w:rPr>
         <w:t xml:space="preserve"> | Trinity College Dublin, Ireland (2025 – 2026, Ongoing)</w:t>
       </w:r>
     </w:p>
@@ -450,16 +767,23 @@
         <w:pStyle w:val="NormalWeb"/>
         <w:numPr>
           <w:ilvl w:val="0"/>
-          <w:numId w:val="12"/>
+          <w:numId w:val="19"/>
         </w:numPr>
+        <w:rPr>
+          <w:rFonts w:asciiTheme="minorHAnsi" w:hAnsiTheme="minorHAnsi" w:cstheme="minorHAnsi"/>
+        </w:rPr>
       </w:pPr>
       <w:r>
         <w:rPr>
           <w:rStyle w:val="Strong"/>
+          <w:rFonts w:asciiTheme="minorHAnsi" w:hAnsiTheme="minorHAnsi" w:cstheme="minorHAnsi"/>
         </w:rPr>
         <w:t>MA Early Education</w:t>
       </w:r>
       <w:r>
+        <w:rPr>
+          <w:rFonts w:asciiTheme="minorHAnsi" w:hAnsiTheme="minorHAnsi" w:cstheme="minorHAnsi"/>
+        </w:rPr>
         <w:t xml:space="preserve"> | Anglia Ruskin University, UK (2016 – 2018)</w:t>
       </w:r>
     </w:p>
@@ -468,16 +792,23 @@
         <w:pStyle w:val="NormalWeb"/>
         <w:numPr>
           <w:ilvl w:val="0"/>
-          <w:numId w:val="12"/>
+          <w:numId w:val="19"/>
         </w:numPr>
+        <w:rPr>
+          <w:rFonts w:asciiTheme="minorHAnsi" w:hAnsiTheme="minorHAnsi" w:cstheme="minorHAnsi"/>
+        </w:rPr>
       </w:pPr>
       <w:r>
         <w:rPr>
           <w:rStyle w:val="Strong"/>
+          <w:rFonts w:asciiTheme="minorHAnsi" w:hAnsiTheme="minorHAnsi" w:cstheme="minorHAnsi"/>
         </w:rPr>
         <w:t>BA Bachelor of Arts</w:t>
       </w:r>
       <w:r>
+        <w:rPr>
+          <w:rFonts w:asciiTheme="minorHAnsi" w:hAnsiTheme="minorHAnsi" w:cstheme="minorHAnsi"/>
+        </w:rPr>
         <w:t xml:space="preserve"> | Flame University, Pune, India (2010 – 2014)</w:t>
       </w:r>
     </w:p>
@@ -486,31 +817,52 @@
         <w:pStyle w:val="NormalWeb"/>
         <w:numPr>
           <w:ilvl w:val="0"/>
-          <w:numId w:val="12"/>
+          <w:numId w:val="19"/>
         </w:numPr>
+        <w:rPr>
+          <w:rFonts w:asciiTheme="minorHAnsi" w:hAnsiTheme="minorHAnsi" w:cstheme="minorHAnsi"/>
+        </w:rPr>
       </w:pPr>
       <w:r>
         <w:rPr>
           <w:rStyle w:val="Strong"/>
+          <w:rFonts w:asciiTheme="minorHAnsi" w:hAnsiTheme="minorHAnsi" w:cstheme="minorHAnsi"/>
         </w:rPr>
         <w:t>Class XII</w:t>
       </w:r>
       <w:r>
+        <w:rPr>
+          <w:rFonts w:asciiTheme="minorHAnsi" w:hAnsiTheme="minorHAnsi" w:cstheme="minorHAnsi"/>
+        </w:rPr>
         <w:t xml:space="preserve"> | Hopetown Girls School, Dehradun, India (2010)</w:t>
       </w:r>
     </w:p>
     <w:p>
-      <w:r>
+      <w:pPr>
+        <w:rPr>
+          <w:rFonts w:cstheme="minorHAnsi"/>
+        </w:rPr>
+      </w:pPr>
+      <w:r>
+        <w:rPr>
+          <w:rFonts w:cstheme="minorHAnsi"/>
+        </w:rPr>
         <w:pict>
-          <v:rect id="_x0000_i1042" style="width:0;height:1.5pt" o:hralign="center" o:hrstd="t" o:hr="t" fillcolor="#a0a0a0" stroked="f"/>
+          <v:rect id="_x0000_i1029" style="width:0;height:1.5pt" o:hralign="center" o:hrstd="t" o:hr="t" fillcolor="#a0a0a0" stroked="f"/>
         </w:pict>
       </w:r>
     </w:p>
     <w:p>
       <w:pPr>
         <w:pStyle w:val="Heading2"/>
-      </w:pPr>
-      <w:r>
+        <w:rPr>
+          <w:rFonts w:asciiTheme="minorHAnsi" w:hAnsiTheme="minorHAnsi" w:cstheme="minorHAnsi"/>
+        </w:rPr>
+      </w:pPr>
+      <w:r>
+        <w:rPr>
+          <w:rFonts w:asciiTheme="minorHAnsi" w:hAnsiTheme="minorHAnsi" w:cstheme="minorHAnsi"/>
+        </w:rPr>
         <w:t>CERTIFICATIONS</w:t>
       </w:r>
     </w:p>
@@ -519,31 +871,52 @@
         <w:pStyle w:val="NormalWeb"/>
         <w:numPr>
           <w:ilvl w:val="0"/>
-          <w:numId w:val="13"/>
+          <w:numId w:val="20"/>
         </w:numPr>
+        <w:rPr>
+          <w:rFonts w:asciiTheme="minorHAnsi" w:hAnsiTheme="minorHAnsi" w:cstheme="minorHAnsi"/>
+        </w:rPr>
       </w:pPr>
       <w:r>
         <w:rPr>
           <w:rStyle w:val="Strong"/>
+          <w:rFonts w:asciiTheme="minorHAnsi" w:hAnsiTheme="minorHAnsi" w:cstheme="minorHAnsi"/>
         </w:rPr>
         <w:t>Innovation of Products and Services: MIT’s Approach to Design Thinking</w:t>
       </w:r>
       <w:r>
+        <w:rPr>
+          <w:rFonts w:asciiTheme="minorHAnsi" w:hAnsiTheme="minorHAnsi" w:cstheme="minorHAnsi"/>
+        </w:rPr>
         <w:t xml:space="preserve"> | MIT Emeritus (2019–2020)</w:t>
       </w:r>
     </w:p>
     <w:p>
-      <w:r>
+      <w:pPr>
+        <w:rPr>
+          <w:rFonts w:cstheme="minorHAnsi"/>
+        </w:rPr>
+      </w:pPr>
+      <w:r>
+        <w:rPr>
+          <w:rFonts w:cstheme="minorHAnsi"/>
+        </w:rPr>
         <w:pict>
-          <v:rect id="_x0000_i1043" style="width:0;height:1.5pt" o:hralign="center" o:hrstd="t" o:hr="t" fillcolor="#a0a0a0" stroked="f"/>
+          <v:rect id="_x0000_i1030" style="width:0;height:1.5pt" o:hralign="center" o:hrstd="t" o:hr="t" fillcolor="#a0a0a0" stroked="f"/>
         </w:pict>
       </w:r>
     </w:p>
     <w:p>
       <w:pPr>
         <w:pStyle w:val="Heading2"/>
-      </w:pPr>
-      <w:r>
+        <w:rPr>
+          <w:rFonts w:asciiTheme="minorHAnsi" w:hAnsiTheme="minorHAnsi" w:cstheme="minorHAnsi"/>
+        </w:rPr>
+      </w:pPr>
+      <w:r>
+        <w:rPr>
+          <w:rFonts w:asciiTheme="minorHAnsi" w:hAnsiTheme="minorHAnsi" w:cstheme="minorHAnsi"/>
+        </w:rPr>
         <w:t>PORTFOLIO &amp; FEATURED PROJECTS</w:t>
       </w:r>
     </w:p>
@@ -552,18 +925,24 @@
         <w:pStyle w:val="NormalWeb"/>
         <w:numPr>
           <w:ilvl w:val="0"/>
-          <w:numId w:val="14"/>
+          <w:numId w:val="21"/>
         </w:numPr>
+        <w:rPr>
+          <w:rFonts w:asciiTheme="minorHAnsi" w:hAnsiTheme="minorHAnsi" w:cstheme="minorHAnsi"/>
+        </w:rPr>
       </w:pPr>
       <w:r>
         <w:rPr>
           <w:rStyle w:val="Strong"/>
-        </w:rPr>
-        <w:lastRenderedPageBreak/>
+          <w:rFonts w:asciiTheme="minorHAnsi" w:hAnsiTheme="minorHAnsi" w:cstheme="minorHAnsi"/>
+        </w:rPr>
         <w:t>Accessible App for Visually Impaired Users (Saksham Trust):</w:t>
       </w:r>
       <w:r>
-        <w:t xml:space="preserve"> Designed an application integrating assistive technologies and inclusive UI patterns. Delivered interactive front-end prototypes and conducted usability testing.</w:t>
+        <w:rPr>
+          <w:rFonts w:asciiTheme="minorHAnsi" w:hAnsiTheme="minorHAnsi" w:cstheme="minorHAnsi"/>
+        </w:rPr>
+        <w:t xml:space="preserve"> Integrated assistive technologies and inclusive UI patterns; created interactive front-end prototypes and conducted usability testing.</w:t>
       </w:r>
     </w:p>
     <w:p>
@@ -571,17 +950,24 @@
         <w:pStyle w:val="NormalWeb"/>
         <w:numPr>
           <w:ilvl w:val="0"/>
-          <w:numId w:val="14"/>
+          <w:numId w:val="21"/>
         </w:numPr>
+        <w:rPr>
+          <w:rFonts w:asciiTheme="minorHAnsi" w:hAnsiTheme="minorHAnsi" w:cstheme="minorHAnsi"/>
+        </w:rPr>
       </w:pPr>
       <w:r>
         <w:rPr>
           <w:rStyle w:val="Strong"/>
+          <w:rFonts w:asciiTheme="minorHAnsi" w:hAnsiTheme="minorHAnsi" w:cstheme="minorHAnsi"/>
         </w:rPr>
         <w:t>FMCG &amp; Banking Client Interfaces (Nihilent):</w:t>
       </w:r>
       <w:r>
-        <w:t xml:space="preserve"> Developed interactive, scalable prototypes using HTML/CSS, improving operational usability.</w:t>
+        <w:rPr>
+          <w:rFonts w:asciiTheme="minorHAnsi" w:hAnsiTheme="minorHAnsi" w:cstheme="minorHAnsi"/>
+        </w:rPr>
+        <w:t xml:space="preserve"> Built scalable prototypes using HTML/CSS, improving usability and workflows.</w:t>
       </w:r>
     </w:p>
     <w:p>
@@ -589,17 +975,24 @@
         <w:pStyle w:val="NormalWeb"/>
         <w:numPr>
           <w:ilvl w:val="0"/>
-          <w:numId w:val="14"/>
+          <w:numId w:val="21"/>
         </w:numPr>
+        <w:rPr>
+          <w:rFonts w:asciiTheme="minorHAnsi" w:hAnsiTheme="minorHAnsi" w:cstheme="minorHAnsi"/>
+        </w:rPr>
       </w:pPr>
       <w:r>
         <w:rPr>
           <w:rStyle w:val="Strong"/>
+          <w:rFonts w:asciiTheme="minorHAnsi" w:hAnsiTheme="minorHAnsi" w:cstheme="minorHAnsi"/>
         </w:rPr>
         <w:t>Corporate Website Revamps (Steinbach &amp; Partner / Nihilent):</w:t>
       </w:r>
       <w:r>
-        <w:t xml:space="preserve"> Led comprehensive redesigns focusing on front-end interactivity, optimized navigation, and accessibility.</w:t>
+        <w:rPr>
+          <w:rFonts w:asciiTheme="minorHAnsi" w:hAnsiTheme="minorHAnsi" w:cstheme="minorHAnsi"/>
+        </w:rPr>
+        <w:t xml:space="preserve"> Led comprehensive redesigns focusing on interactivity, navigation, and accessibility.</w:t>
       </w:r>
     </w:p>
     <w:p>
@@ -607,26 +1000,37 @@
         <w:pStyle w:val="NormalWeb"/>
         <w:numPr>
           <w:ilvl w:val="0"/>
-          <w:numId w:val="14"/>
+          <w:numId w:val="21"/>
         </w:numPr>
+        <w:rPr>
+          <w:rFonts w:asciiTheme="minorHAnsi" w:hAnsiTheme="minorHAnsi" w:cstheme="minorHAnsi"/>
+        </w:rPr>
       </w:pPr>
       <w:r>
         <w:rPr>
           <w:rStyle w:val="Strong"/>
+          <w:rFonts w:asciiTheme="minorHAnsi" w:hAnsiTheme="minorHAnsi" w:cstheme="minorHAnsi"/>
         </w:rPr>
         <w:t>[Insert Project Name from MA/Personal Work]:</w:t>
       </w:r>
       <w:r>
+        <w:rPr>
+          <w:rFonts w:asciiTheme="minorHAnsi" w:hAnsiTheme="minorHAnsi" w:cstheme="minorHAnsi"/>
+        </w:rPr>
         <w:t xml:space="preserve"> </w:t>
       </w:r>
       <w:r>
         <w:rPr>
           <w:rStyle w:val="Emphasis"/>
+          <w:rFonts w:asciiTheme="minorHAnsi" w:hAnsiTheme="minorHAnsi" w:cstheme="minorHAnsi"/>
         </w:rPr>
         <w:t>[Brief description of problem solved, tools used, and outcome achieved with a link to prototype/case study.]</w:t>
       </w:r>
     </w:p>
-    <w:p/>
+    <w:p>
+      <w:bookmarkStart w:id="0" w:name="_GoBack"/>
+      <w:bookmarkEnd w:id="0"/>
+    </w:p>
     <w:sectPr>
       <w:pgSz w:w="11906" w:h="16838"/>
       <w:pgMar w:top="1440" w:right="1440" w:bottom="1440" w:left="1440" w:header="708" w:footer="708" w:gutter="0"/>
@@ -988,6 +1392,453 @@
     </w:lvl>
   </w:abstractNum>
   <w:abstractNum w:abstractNumId="2" w15:restartNumberingAfterBreak="0">
+    <w:nsid w:val="0FC40676"/>
+    <w:multiLevelType w:val="multilevel"/>
+    <w:tmpl w:val="35206F52"/>
+    <w:lvl w:ilvl="0">
+      <w:start w:val="1"/>
+      <w:numFmt w:val="bullet"/>
+      <w:lvlText w:val=""/>
+      <w:lvlJc w:val="left"/>
+      <w:pPr>
+        <w:tabs>
+          <w:tab w:val="num" w:pos="720"/>
+        </w:tabs>
+        <w:ind w:left="720" w:hanging="360"/>
+      </w:pPr>
+      <w:rPr>
+        <w:rFonts w:ascii="Symbol" w:hAnsi="Symbol" w:hint="default"/>
+        <w:sz w:val="20"/>
+      </w:rPr>
+    </w:lvl>
+    <w:lvl w:ilvl="1" w:tentative="1">
+      <w:start w:val="1"/>
+      <w:numFmt w:val="bullet"/>
+      <w:lvlText w:val="o"/>
+      <w:lvlJc w:val="left"/>
+      <w:pPr>
+        <w:tabs>
+          <w:tab w:val="num" w:pos="1440"/>
+        </w:tabs>
+        <w:ind w:left="1440" w:hanging="360"/>
+      </w:pPr>
+      <w:rPr>
+        <w:rFonts w:ascii="Courier New" w:hAnsi="Courier New" w:hint="default"/>
+        <w:sz w:val="20"/>
+      </w:rPr>
+    </w:lvl>
+    <w:lvl w:ilvl="2" w:tentative="1">
+      <w:start w:val="1"/>
+      <w:numFmt w:val="bullet"/>
+      <w:lvlText w:val=""/>
+      <w:lvlJc w:val="left"/>
+      <w:pPr>
+        <w:tabs>
+          <w:tab w:val="num" w:pos="2160"/>
+        </w:tabs>
+        <w:ind w:left="2160" w:hanging="360"/>
+      </w:pPr>
+      <w:rPr>
+        <w:rFonts w:ascii="Wingdings" w:hAnsi="Wingdings" w:hint="default"/>
+        <w:sz w:val="20"/>
+      </w:rPr>
+    </w:lvl>
+    <w:lvl w:ilvl="3" w:tentative="1">
+      <w:start w:val="1"/>
+      <w:numFmt w:val="bullet"/>
+      <w:lvlText w:val=""/>
+      <w:lvlJc w:val="left"/>
+      <w:pPr>
+        <w:tabs>
+          <w:tab w:val="num" w:pos="2880"/>
+        </w:tabs>
+        <w:ind w:left="2880" w:hanging="360"/>
+      </w:pPr>
+      <w:rPr>
+        <w:rFonts w:ascii="Wingdings" w:hAnsi="Wingdings" w:hint="default"/>
+        <w:sz w:val="20"/>
+      </w:rPr>
+    </w:lvl>
+    <w:lvl w:ilvl="4" w:tentative="1">
+      <w:start w:val="1"/>
+      <w:numFmt w:val="bullet"/>
+      <w:lvlText w:val=""/>
+      <w:lvlJc w:val="left"/>
+      <w:pPr>
+        <w:tabs>
+          <w:tab w:val="num" w:pos="3600"/>
+        </w:tabs>
+        <w:ind w:left="3600" w:hanging="360"/>
+      </w:pPr>
+      <w:rPr>
+        <w:rFonts w:ascii="Wingdings" w:hAnsi="Wingdings" w:hint="default"/>
+        <w:sz w:val="20"/>
+      </w:rPr>
+    </w:lvl>
+    <w:lvl w:ilvl="5" w:tentative="1">
+      <w:start w:val="1"/>
+      <w:numFmt w:val="bullet"/>
+      <w:lvlText w:val=""/>
+      <w:lvlJc w:val="left"/>
+      <w:pPr>
+        <w:tabs>
+          <w:tab w:val="num" w:pos="4320"/>
+        </w:tabs>
+        <w:ind w:left="4320" w:hanging="360"/>
+      </w:pPr>
+      <w:rPr>
+        <w:rFonts w:ascii="Wingdings" w:hAnsi="Wingdings" w:hint="default"/>
+        <w:sz w:val="20"/>
+      </w:rPr>
+    </w:lvl>
+    <w:lvl w:ilvl="6" w:tentative="1">
+      <w:start w:val="1"/>
+      <w:numFmt w:val="bullet"/>
+      <w:lvlText w:val=""/>
+      <w:lvlJc w:val="left"/>
+      <w:pPr>
+        <w:tabs>
+          <w:tab w:val="num" w:pos="5040"/>
+        </w:tabs>
+        <w:ind w:left="5040" w:hanging="360"/>
+      </w:pPr>
+      <w:rPr>
+        <w:rFonts w:ascii="Wingdings" w:hAnsi="Wingdings" w:hint="default"/>
+        <w:sz w:val="20"/>
+      </w:rPr>
+    </w:lvl>
+    <w:lvl w:ilvl="7" w:tentative="1">
+      <w:start w:val="1"/>
+      <w:numFmt w:val="bullet"/>
+      <w:lvlText w:val=""/>
+      <w:lvlJc w:val="left"/>
+      <w:pPr>
+        <w:tabs>
+          <w:tab w:val="num" w:pos="5760"/>
+        </w:tabs>
+        <w:ind w:left="5760" w:hanging="360"/>
+      </w:pPr>
+      <w:rPr>
+        <w:rFonts w:ascii="Wingdings" w:hAnsi="Wingdings" w:hint="default"/>
+        <w:sz w:val="20"/>
+      </w:rPr>
+    </w:lvl>
+    <w:lvl w:ilvl="8" w:tentative="1">
+      <w:start w:val="1"/>
+      <w:numFmt w:val="bullet"/>
+      <w:lvlText w:val=""/>
+      <w:lvlJc w:val="left"/>
+      <w:pPr>
+        <w:tabs>
+          <w:tab w:val="num" w:pos="6480"/>
+        </w:tabs>
+        <w:ind w:left="6480" w:hanging="360"/>
+      </w:pPr>
+      <w:rPr>
+        <w:rFonts w:ascii="Wingdings" w:hAnsi="Wingdings" w:hint="default"/>
+        <w:sz w:val="20"/>
+      </w:rPr>
+    </w:lvl>
+  </w:abstractNum>
+  <w:abstractNum w:abstractNumId="3" w15:restartNumberingAfterBreak="0">
+    <w:nsid w:val="19AB66AF"/>
+    <w:multiLevelType w:val="multilevel"/>
+    <w:tmpl w:val="338C0C04"/>
+    <w:lvl w:ilvl="0">
+      <w:start w:val="1"/>
+      <w:numFmt w:val="bullet"/>
+      <w:lvlText w:val=""/>
+      <w:lvlJc w:val="left"/>
+      <w:pPr>
+        <w:tabs>
+          <w:tab w:val="num" w:pos="720"/>
+        </w:tabs>
+        <w:ind w:left="720" w:hanging="360"/>
+      </w:pPr>
+      <w:rPr>
+        <w:rFonts w:ascii="Symbol" w:hAnsi="Symbol" w:hint="default"/>
+        <w:sz w:val="20"/>
+      </w:rPr>
+    </w:lvl>
+    <w:lvl w:ilvl="1" w:tentative="1">
+      <w:start w:val="1"/>
+      <w:numFmt w:val="bullet"/>
+      <w:lvlText w:val="o"/>
+      <w:lvlJc w:val="left"/>
+      <w:pPr>
+        <w:tabs>
+          <w:tab w:val="num" w:pos="1440"/>
+        </w:tabs>
+        <w:ind w:left="1440" w:hanging="360"/>
+      </w:pPr>
+      <w:rPr>
+        <w:rFonts w:ascii="Courier New" w:hAnsi="Courier New" w:hint="default"/>
+        <w:sz w:val="20"/>
+      </w:rPr>
+    </w:lvl>
+    <w:lvl w:ilvl="2" w:tentative="1">
+      <w:start w:val="1"/>
+      <w:numFmt w:val="bullet"/>
+      <w:lvlText w:val=""/>
+      <w:lvlJc w:val="left"/>
+      <w:pPr>
+        <w:tabs>
+          <w:tab w:val="num" w:pos="2160"/>
+        </w:tabs>
+        <w:ind w:left="2160" w:hanging="360"/>
+      </w:pPr>
+      <w:rPr>
+        <w:rFonts w:ascii="Wingdings" w:hAnsi="Wingdings" w:hint="default"/>
+        <w:sz w:val="20"/>
+      </w:rPr>
+    </w:lvl>
+    <w:lvl w:ilvl="3" w:tentative="1">
+      <w:start w:val="1"/>
+      <w:numFmt w:val="bullet"/>
+      <w:lvlText w:val=""/>
+      <w:lvlJc w:val="left"/>
+      <w:pPr>
+        <w:tabs>
+          <w:tab w:val="num" w:pos="2880"/>
+        </w:tabs>
+        <w:ind w:left="2880" w:hanging="360"/>
+      </w:pPr>
+      <w:rPr>
+        <w:rFonts w:ascii="Wingdings" w:hAnsi="Wingdings" w:hint="default"/>
+        <w:sz w:val="20"/>
+      </w:rPr>
+    </w:lvl>
+    <w:lvl w:ilvl="4" w:tentative="1">
+      <w:start w:val="1"/>
+      <w:numFmt w:val="bullet"/>
+      <w:lvlText w:val=""/>
+      <w:lvlJc w:val="left"/>
+      <w:pPr>
+        <w:tabs>
+          <w:tab w:val="num" w:pos="3600"/>
+        </w:tabs>
+        <w:ind w:left="3600" w:hanging="360"/>
+      </w:pPr>
+      <w:rPr>
+        <w:rFonts w:ascii="Wingdings" w:hAnsi="Wingdings" w:hint="default"/>
+        <w:sz w:val="20"/>
+      </w:rPr>
+    </w:lvl>
+    <w:lvl w:ilvl="5" w:tentative="1">
+      <w:start w:val="1"/>
+      <w:numFmt w:val="bullet"/>
+      <w:lvlText w:val=""/>
+      <w:lvlJc w:val="left"/>
+      <w:pPr>
+        <w:tabs>
+          <w:tab w:val="num" w:pos="4320"/>
+        </w:tabs>
+        <w:ind w:left="4320" w:hanging="360"/>
+      </w:pPr>
+      <w:rPr>
+        <w:rFonts w:ascii="Wingdings" w:hAnsi="Wingdings" w:hint="default"/>
+        <w:sz w:val="20"/>
+      </w:rPr>
+    </w:lvl>
+    <w:lvl w:ilvl="6" w:tentative="1">
+      <w:start w:val="1"/>
+      <w:numFmt w:val="bullet"/>
+      <w:lvlText w:val=""/>
+      <w:lvlJc w:val="left"/>
+      <w:pPr>
+        <w:tabs>
+          <w:tab w:val="num" w:pos="5040"/>
+        </w:tabs>
+        <w:ind w:left="5040" w:hanging="360"/>
+      </w:pPr>
+      <w:rPr>
+        <w:rFonts w:ascii="Wingdings" w:hAnsi="Wingdings" w:hint="default"/>
+        <w:sz w:val="20"/>
+      </w:rPr>
+    </w:lvl>
+    <w:lvl w:ilvl="7" w:tentative="1">
+      <w:start w:val="1"/>
+      <w:numFmt w:val="bullet"/>
+      <w:lvlText w:val=""/>
+      <w:lvlJc w:val="left"/>
+      <w:pPr>
+        <w:tabs>
+          <w:tab w:val="num" w:pos="5760"/>
+        </w:tabs>
+        <w:ind w:left="5760" w:hanging="360"/>
+      </w:pPr>
+      <w:rPr>
+        <w:rFonts w:ascii="Wingdings" w:hAnsi="Wingdings" w:hint="default"/>
+        <w:sz w:val="20"/>
+      </w:rPr>
+    </w:lvl>
+    <w:lvl w:ilvl="8" w:tentative="1">
+      <w:start w:val="1"/>
+      <w:numFmt w:val="bullet"/>
+      <w:lvlText w:val=""/>
+      <w:lvlJc w:val="left"/>
+      <w:pPr>
+        <w:tabs>
+          <w:tab w:val="num" w:pos="6480"/>
+        </w:tabs>
+        <w:ind w:left="6480" w:hanging="360"/>
+      </w:pPr>
+      <w:rPr>
+        <w:rFonts w:ascii="Wingdings" w:hAnsi="Wingdings" w:hint="default"/>
+        <w:sz w:val="20"/>
+      </w:rPr>
+    </w:lvl>
+  </w:abstractNum>
+  <w:abstractNum w:abstractNumId="4" w15:restartNumberingAfterBreak="0">
+    <w:nsid w:val="1A6264CF"/>
+    <w:multiLevelType w:val="multilevel"/>
+    <w:tmpl w:val="63D43D6C"/>
+    <w:lvl w:ilvl="0">
+      <w:start w:val="1"/>
+      <w:numFmt w:val="bullet"/>
+      <w:lvlText w:val=""/>
+      <w:lvlJc w:val="left"/>
+      <w:pPr>
+        <w:tabs>
+          <w:tab w:val="num" w:pos="720"/>
+        </w:tabs>
+        <w:ind w:left="720" w:hanging="360"/>
+      </w:pPr>
+      <w:rPr>
+        <w:rFonts w:ascii="Symbol" w:hAnsi="Symbol" w:hint="default"/>
+        <w:sz w:val="20"/>
+      </w:rPr>
+    </w:lvl>
+    <w:lvl w:ilvl="1" w:tentative="1">
+      <w:start w:val="1"/>
+      <w:numFmt w:val="bullet"/>
+      <w:lvlText w:val="o"/>
+      <w:lvlJc w:val="left"/>
+      <w:pPr>
+        <w:tabs>
+          <w:tab w:val="num" w:pos="1440"/>
+        </w:tabs>
+        <w:ind w:left="1440" w:hanging="360"/>
+      </w:pPr>
+      <w:rPr>
+        <w:rFonts w:ascii="Courier New" w:hAnsi="Courier New" w:hint="default"/>
+        <w:sz w:val="20"/>
+      </w:rPr>
+    </w:lvl>
+    <w:lvl w:ilvl="2" w:tentative="1">
+      <w:start w:val="1"/>
+      <w:numFmt w:val="bullet"/>
+      <w:lvlText w:val=""/>
+      <w:lvlJc w:val="left"/>
+      <w:pPr>
+        <w:tabs>
+          <w:tab w:val="num" w:pos="2160"/>
+        </w:tabs>
+        <w:ind w:left="2160" w:hanging="360"/>
+      </w:pPr>
+      <w:rPr>
+        <w:rFonts w:ascii="Wingdings" w:hAnsi="Wingdings" w:hint="default"/>
+        <w:sz w:val="20"/>
+      </w:rPr>
+    </w:lvl>
+    <w:lvl w:ilvl="3" w:tentative="1">
+      <w:start w:val="1"/>
+      <w:numFmt w:val="bullet"/>
+      <w:lvlText w:val=""/>
+      <w:lvlJc w:val="left"/>
+      <w:pPr>
+        <w:tabs>
+          <w:tab w:val="num" w:pos="2880"/>
+        </w:tabs>
+        <w:ind w:left="2880" w:hanging="360"/>
+      </w:pPr>
+      <w:rPr>
+        <w:rFonts w:ascii="Wingdings" w:hAnsi="Wingdings" w:hint="default"/>
+        <w:sz w:val="20"/>
+      </w:rPr>
+    </w:lvl>
+    <w:lvl w:ilvl="4" w:tentative="1">
+      <w:start w:val="1"/>
+      <w:numFmt w:val="bullet"/>
+      <w:lvlText w:val=""/>
+      <w:lvlJc w:val="left"/>
+      <w:pPr>
+        <w:tabs>
+          <w:tab w:val="num" w:pos="3600"/>
+        </w:tabs>
+        <w:ind w:left="3600" w:hanging="360"/>
+      </w:pPr>
+      <w:rPr>
+        <w:rFonts w:ascii="Wingdings" w:hAnsi="Wingdings" w:hint="default"/>
+        <w:sz w:val="20"/>
+      </w:rPr>
+    </w:lvl>
+    <w:lvl w:ilvl="5" w:tentative="1">
+      <w:start w:val="1"/>
+      <w:numFmt w:val="bullet"/>
+      <w:lvlText w:val=""/>
+      <w:lvlJc w:val="left"/>
+      <w:pPr>
+        <w:tabs>
+          <w:tab w:val="num" w:pos="4320"/>
+        </w:tabs>
+        <w:ind w:left="4320" w:hanging="360"/>
+      </w:pPr>
+      <w:rPr>
+        <w:rFonts w:ascii="Wingdings" w:hAnsi="Wingdings" w:hint="default"/>
+        <w:sz w:val="20"/>
+      </w:rPr>
+    </w:lvl>
+    <w:lvl w:ilvl="6" w:tentative="1">
+      <w:start w:val="1"/>
+      <w:numFmt w:val="bullet"/>
+      <w:lvlText w:val=""/>
+      <w:lvlJc w:val="left"/>
+      <w:pPr>
+        <w:tabs>
+          <w:tab w:val="num" w:pos="5040"/>
+        </w:tabs>
+        <w:ind w:left="5040" w:hanging="360"/>
+      </w:pPr>
+      <w:rPr>
+        <w:rFonts w:ascii="Wingdings" w:hAnsi="Wingdings" w:hint="default"/>
+        <w:sz w:val="20"/>
+      </w:rPr>
+    </w:lvl>
+    <w:lvl w:ilvl="7" w:tentative="1">
+      <w:start w:val="1"/>
+      <w:numFmt w:val="bullet"/>
+      <w:lvlText w:val=""/>
+      <w:lvlJc w:val="left"/>
+      <w:pPr>
+        <w:tabs>
+          <w:tab w:val="num" w:pos="5760"/>
+        </w:tabs>
+        <w:ind w:left="5760" w:hanging="360"/>
+      </w:pPr>
+      <w:rPr>
+        <w:rFonts w:ascii="Wingdings" w:hAnsi="Wingdings" w:hint="default"/>
+        <w:sz w:val="20"/>
+      </w:rPr>
+    </w:lvl>
+    <w:lvl w:ilvl="8" w:tentative="1">
+      <w:start w:val="1"/>
+      <w:numFmt w:val="bullet"/>
+      <w:lvlText w:val=""/>
+      <w:lvlJc w:val="left"/>
+      <w:pPr>
+        <w:tabs>
+          <w:tab w:val="num" w:pos="6480"/>
+        </w:tabs>
+        <w:ind w:left="6480" w:hanging="360"/>
+      </w:pPr>
+      <w:rPr>
+        <w:rFonts w:ascii="Wingdings" w:hAnsi="Wingdings" w:hint="default"/>
+        <w:sz w:val="20"/>
+      </w:rPr>
+    </w:lvl>
+  </w:abstractNum>
+  <w:abstractNum w:abstractNumId="5" w15:restartNumberingAfterBreak="0">
     <w:nsid w:val="1AB24647"/>
     <w:multiLevelType w:val="multilevel"/>
     <w:tmpl w:val="AD5AE64C"/>
@@ -1136,7 +1987,156 @@
       </w:rPr>
     </w:lvl>
   </w:abstractNum>
-  <w:abstractNum w:abstractNumId="3" w15:restartNumberingAfterBreak="0">
+  <w:abstractNum w:abstractNumId="6" w15:restartNumberingAfterBreak="0">
+    <w:nsid w:val="1C396796"/>
+    <w:multiLevelType w:val="multilevel"/>
+    <w:tmpl w:val="58AE99F4"/>
+    <w:lvl w:ilvl="0">
+      <w:start w:val="1"/>
+      <w:numFmt w:val="bullet"/>
+      <w:lvlText w:val=""/>
+      <w:lvlJc w:val="left"/>
+      <w:pPr>
+        <w:tabs>
+          <w:tab w:val="num" w:pos="720"/>
+        </w:tabs>
+        <w:ind w:left="720" w:hanging="360"/>
+      </w:pPr>
+      <w:rPr>
+        <w:rFonts w:ascii="Symbol" w:hAnsi="Symbol" w:hint="default"/>
+        <w:sz w:val="20"/>
+      </w:rPr>
+    </w:lvl>
+    <w:lvl w:ilvl="1" w:tentative="1">
+      <w:start w:val="1"/>
+      <w:numFmt w:val="bullet"/>
+      <w:lvlText w:val="o"/>
+      <w:lvlJc w:val="left"/>
+      <w:pPr>
+        <w:tabs>
+          <w:tab w:val="num" w:pos="1440"/>
+        </w:tabs>
+        <w:ind w:left="1440" w:hanging="360"/>
+      </w:pPr>
+      <w:rPr>
+        <w:rFonts w:ascii="Courier New" w:hAnsi="Courier New" w:hint="default"/>
+        <w:sz w:val="20"/>
+      </w:rPr>
+    </w:lvl>
+    <w:lvl w:ilvl="2" w:tentative="1">
+      <w:start w:val="1"/>
+      <w:numFmt w:val="bullet"/>
+      <w:lvlText w:val=""/>
+      <w:lvlJc w:val="left"/>
+      <w:pPr>
+        <w:tabs>
+          <w:tab w:val="num" w:pos="2160"/>
+        </w:tabs>
+        <w:ind w:left="2160" w:hanging="360"/>
+      </w:pPr>
+      <w:rPr>
+        <w:rFonts w:ascii="Wingdings" w:hAnsi="Wingdings" w:hint="default"/>
+        <w:sz w:val="20"/>
+      </w:rPr>
+    </w:lvl>
+    <w:lvl w:ilvl="3" w:tentative="1">
+      <w:start w:val="1"/>
+      <w:numFmt w:val="bullet"/>
+      <w:lvlText w:val=""/>
+      <w:lvlJc w:val="left"/>
+      <w:pPr>
+        <w:tabs>
+          <w:tab w:val="num" w:pos="2880"/>
+        </w:tabs>
+        <w:ind w:left="2880" w:hanging="360"/>
+      </w:pPr>
+      <w:rPr>
+        <w:rFonts w:ascii="Wingdings" w:hAnsi="Wingdings" w:hint="default"/>
+        <w:sz w:val="20"/>
+      </w:rPr>
+    </w:lvl>
+    <w:lvl w:ilvl="4" w:tentative="1">
+      <w:start w:val="1"/>
+      <w:numFmt w:val="bullet"/>
+      <w:lvlText w:val=""/>
+      <w:lvlJc w:val="left"/>
+      <w:pPr>
+        <w:tabs>
+          <w:tab w:val="num" w:pos="3600"/>
+        </w:tabs>
+        <w:ind w:left="3600" w:hanging="360"/>
+      </w:pPr>
+      <w:rPr>
+        <w:rFonts w:ascii="Wingdings" w:hAnsi="Wingdings" w:hint="default"/>
+        <w:sz w:val="20"/>
+      </w:rPr>
+    </w:lvl>
+    <w:lvl w:ilvl="5" w:tentative="1">
+      <w:start w:val="1"/>
+      <w:numFmt w:val="bullet"/>
+      <w:lvlText w:val=""/>
+      <w:lvlJc w:val="left"/>
+      <w:pPr>
+        <w:tabs>
+          <w:tab w:val="num" w:pos="4320"/>
+        </w:tabs>
+        <w:ind w:left="4320" w:hanging="360"/>
+      </w:pPr>
+      <w:rPr>
+        <w:rFonts w:ascii="Wingdings" w:hAnsi="Wingdings" w:hint="default"/>
+        <w:sz w:val="20"/>
+      </w:rPr>
+    </w:lvl>
+    <w:lvl w:ilvl="6" w:tentative="1">
+      <w:start w:val="1"/>
+      <w:numFmt w:val="bullet"/>
+      <w:lvlText w:val=""/>
+      <w:lvlJc w:val="left"/>
+      <w:pPr>
+        <w:tabs>
+          <w:tab w:val="num" w:pos="5040"/>
+        </w:tabs>
+        <w:ind w:left="5040" w:hanging="360"/>
+      </w:pPr>
+      <w:rPr>
+        <w:rFonts w:ascii="Wingdings" w:hAnsi="Wingdings" w:hint="default"/>
+        <w:sz w:val="20"/>
+      </w:rPr>
+    </w:lvl>
+    <w:lvl w:ilvl="7" w:tentative="1">
+      <w:start w:val="1"/>
+      <w:numFmt w:val="bullet"/>
+      <w:lvlText w:val=""/>
+      <w:lvlJc w:val="left"/>
+      <w:pPr>
+        <w:tabs>
+          <w:tab w:val="num" w:pos="5760"/>
+        </w:tabs>
+        <w:ind w:left="5760" w:hanging="360"/>
+      </w:pPr>
+      <w:rPr>
+        <w:rFonts w:ascii="Wingdings" w:hAnsi="Wingdings" w:hint="default"/>
+        <w:sz w:val="20"/>
+      </w:rPr>
+    </w:lvl>
+    <w:lvl w:ilvl="8" w:tentative="1">
+      <w:start w:val="1"/>
+      <w:numFmt w:val="bullet"/>
+      <w:lvlText w:val=""/>
+      <w:lvlJc w:val="left"/>
+      <w:pPr>
+        <w:tabs>
+          <w:tab w:val="num" w:pos="6480"/>
+        </w:tabs>
+        <w:ind w:left="6480" w:hanging="360"/>
+      </w:pPr>
+      <w:rPr>
+        <w:rFonts w:ascii="Wingdings" w:hAnsi="Wingdings" w:hint="default"/>
+        <w:sz w:val="20"/>
+      </w:rPr>
+    </w:lvl>
+  </w:abstractNum>
+  <w:abstractNum w:abstractNumId="7" w15:restartNumberingAfterBreak="0">
     <w:nsid w:val="1D3F3122"/>
     <w:multiLevelType w:val="multilevel"/>
     <w:tmpl w:val="2E48F7E4"/>
@@ -1285,7 +2285,156 @@
       </w:rPr>
     </w:lvl>
   </w:abstractNum>
-  <w:abstractNum w:abstractNumId="4" w15:restartNumberingAfterBreak="0">
+  <w:abstractNum w:abstractNumId="8" w15:restartNumberingAfterBreak="0">
+    <w:nsid w:val="21917B75"/>
+    <w:multiLevelType w:val="multilevel"/>
+    <w:tmpl w:val="0122BBE8"/>
+    <w:lvl w:ilvl="0">
+      <w:start w:val="1"/>
+      <w:numFmt w:val="bullet"/>
+      <w:lvlText w:val=""/>
+      <w:lvlJc w:val="left"/>
+      <w:pPr>
+        <w:tabs>
+          <w:tab w:val="num" w:pos="720"/>
+        </w:tabs>
+        <w:ind w:left="720" w:hanging="360"/>
+      </w:pPr>
+      <w:rPr>
+        <w:rFonts w:ascii="Symbol" w:hAnsi="Symbol" w:hint="default"/>
+        <w:sz w:val="20"/>
+      </w:rPr>
+    </w:lvl>
+    <w:lvl w:ilvl="1" w:tentative="1">
+      <w:start w:val="1"/>
+      <w:numFmt w:val="bullet"/>
+      <w:lvlText w:val="o"/>
+      <w:lvlJc w:val="left"/>
+      <w:pPr>
+        <w:tabs>
+          <w:tab w:val="num" w:pos="1440"/>
+        </w:tabs>
+        <w:ind w:left="1440" w:hanging="360"/>
+      </w:pPr>
+      <w:rPr>
+        <w:rFonts w:ascii="Courier New" w:hAnsi="Courier New" w:hint="default"/>
+        <w:sz w:val="20"/>
+      </w:rPr>
+    </w:lvl>
+    <w:lvl w:ilvl="2" w:tentative="1">
+      <w:start w:val="1"/>
+      <w:numFmt w:val="bullet"/>
+      <w:lvlText w:val=""/>
+      <w:lvlJc w:val="left"/>
+      <w:pPr>
+        <w:tabs>
+          <w:tab w:val="num" w:pos="2160"/>
+        </w:tabs>
+        <w:ind w:left="2160" w:hanging="360"/>
+      </w:pPr>
+      <w:rPr>
+        <w:rFonts w:ascii="Wingdings" w:hAnsi="Wingdings" w:hint="default"/>
+        <w:sz w:val="20"/>
+      </w:rPr>
+    </w:lvl>
+    <w:lvl w:ilvl="3" w:tentative="1">
+      <w:start w:val="1"/>
+      <w:numFmt w:val="bullet"/>
+      <w:lvlText w:val=""/>
+      <w:lvlJc w:val="left"/>
+      <w:pPr>
+        <w:tabs>
+          <w:tab w:val="num" w:pos="2880"/>
+        </w:tabs>
+        <w:ind w:left="2880" w:hanging="360"/>
+      </w:pPr>
+      <w:rPr>
+        <w:rFonts w:ascii="Wingdings" w:hAnsi="Wingdings" w:hint="default"/>
+        <w:sz w:val="20"/>
+      </w:rPr>
+    </w:lvl>
+    <w:lvl w:ilvl="4" w:tentative="1">
+      <w:start w:val="1"/>
+      <w:numFmt w:val="bullet"/>
+      <w:lvlText w:val=""/>
+      <w:lvlJc w:val="left"/>
+      <w:pPr>
+        <w:tabs>
+          <w:tab w:val="num" w:pos="3600"/>
+        </w:tabs>
+        <w:ind w:left="3600" w:hanging="360"/>
+      </w:pPr>
+      <w:rPr>
+        <w:rFonts w:ascii="Wingdings" w:hAnsi="Wingdings" w:hint="default"/>
+        <w:sz w:val="20"/>
+      </w:rPr>
+    </w:lvl>
+    <w:lvl w:ilvl="5" w:tentative="1">
+      <w:start w:val="1"/>
+      <w:numFmt w:val="bullet"/>
+      <w:lvlText w:val=""/>
+      <w:lvlJc w:val="left"/>
+      <w:pPr>
+        <w:tabs>
+          <w:tab w:val="num" w:pos="4320"/>
+        </w:tabs>
+        <w:ind w:left="4320" w:hanging="360"/>
+      </w:pPr>
+      <w:rPr>
+        <w:rFonts w:ascii="Wingdings" w:hAnsi="Wingdings" w:hint="default"/>
+        <w:sz w:val="20"/>
+      </w:rPr>
+    </w:lvl>
+    <w:lvl w:ilvl="6" w:tentative="1">
+      <w:start w:val="1"/>
+      <w:numFmt w:val="bullet"/>
+      <w:lvlText w:val=""/>
+      <w:lvlJc w:val="left"/>
+      <w:pPr>
+        <w:tabs>
+          <w:tab w:val="num" w:pos="5040"/>
+        </w:tabs>
+        <w:ind w:left="5040" w:hanging="360"/>
+      </w:pPr>
+      <w:rPr>
+        <w:rFonts w:ascii="Wingdings" w:hAnsi="Wingdings" w:hint="default"/>
+        <w:sz w:val="20"/>
+      </w:rPr>
+    </w:lvl>
+    <w:lvl w:ilvl="7" w:tentative="1">
+      <w:start w:val="1"/>
+      <w:numFmt w:val="bullet"/>
+      <w:lvlText w:val=""/>
+      <w:lvlJc w:val="left"/>
+      <w:pPr>
+        <w:tabs>
+          <w:tab w:val="num" w:pos="5760"/>
+        </w:tabs>
+        <w:ind w:left="5760" w:hanging="360"/>
+      </w:pPr>
+      <w:rPr>
+        <w:rFonts w:ascii="Wingdings" w:hAnsi="Wingdings" w:hint="default"/>
+        <w:sz w:val="20"/>
+      </w:rPr>
+    </w:lvl>
+    <w:lvl w:ilvl="8" w:tentative="1">
+      <w:start w:val="1"/>
+      <w:numFmt w:val="bullet"/>
+      <w:lvlText w:val=""/>
+      <w:lvlJc w:val="left"/>
+      <w:pPr>
+        <w:tabs>
+          <w:tab w:val="num" w:pos="6480"/>
+        </w:tabs>
+        <w:ind w:left="6480" w:hanging="360"/>
+      </w:pPr>
+      <w:rPr>
+        <w:rFonts w:ascii="Wingdings" w:hAnsi="Wingdings" w:hint="default"/>
+        <w:sz w:val="20"/>
+      </w:rPr>
+    </w:lvl>
+  </w:abstractNum>
+  <w:abstractNum w:abstractNumId="9" w15:restartNumberingAfterBreak="0">
     <w:nsid w:val="27A50EFD"/>
     <w:multiLevelType w:val="multilevel"/>
     <w:tmpl w:val="50B48F38"/>
@@ -1398,7 +2547,156 @@
       </w:pPr>
     </w:lvl>
   </w:abstractNum>
-  <w:abstractNum w:abstractNumId="5" w15:restartNumberingAfterBreak="0">
+  <w:abstractNum w:abstractNumId="10" w15:restartNumberingAfterBreak="0">
+    <w:nsid w:val="2E000463"/>
+    <w:multiLevelType w:val="multilevel"/>
+    <w:tmpl w:val="D534BE82"/>
+    <w:lvl w:ilvl="0">
+      <w:start w:val="1"/>
+      <w:numFmt w:val="bullet"/>
+      <w:lvlText w:val=""/>
+      <w:lvlJc w:val="left"/>
+      <w:pPr>
+        <w:tabs>
+          <w:tab w:val="num" w:pos="720"/>
+        </w:tabs>
+        <w:ind w:left="720" w:hanging="360"/>
+      </w:pPr>
+      <w:rPr>
+        <w:rFonts w:ascii="Symbol" w:hAnsi="Symbol" w:hint="default"/>
+        <w:sz w:val="20"/>
+      </w:rPr>
+    </w:lvl>
+    <w:lvl w:ilvl="1" w:tentative="1">
+      <w:start w:val="1"/>
+      <w:numFmt w:val="bullet"/>
+      <w:lvlText w:val="o"/>
+      <w:lvlJc w:val="left"/>
+      <w:pPr>
+        <w:tabs>
+          <w:tab w:val="num" w:pos="1440"/>
+        </w:tabs>
+        <w:ind w:left="1440" w:hanging="360"/>
+      </w:pPr>
+      <w:rPr>
+        <w:rFonts w:ascii="Courier New" w:hAnsi="Courier New" w:hint="default"/>
+        <w:sz w:val="20"/>
+      </w:rPr>
+    </w:lvl>
+    <w:lvl w:ilvl="2" w:tentative="1">
+      <w:start w:val="1"/>
+      <w:numFmt w:val="bullet"/>
+      <w:lvlText w:val=""/>
+      <w:lvlJc w:val="left"/>
+      <w:pPr>
+        <w:tabs>
+          <w:tab w:val="num" w:pos="2160"/>
+        </w:tabs>
+        <w:ind w:left="2160" w:hanging="360"/>
+      </w:pPr>
+      <w:rPr>
+        <w:rFonts w:ascii="Wingdings" w:hAnsi="Wingdings" w:hint="default"/>
+        <w:sz w:val="20"/>
+      </w:rPr>
+    </w:lvl>
+    <w:lvl w:ilvl="3" w:tentative="1">
+      <w:start w:val="1"/>
+      <w:numFmt w:val="bullet"/>
+      <w:lvlText w:val=""/>
+      <w:lvlJc w:val="left"/>
+      <w:pPr>
+        <w:tabs>
+          <w:tab w:val="num" w:pos="2880"/>
+        </w:tabs>
+        <w:ind w:left="2880" w:hanging="360"/>
+      </w:pPr>
+      <w:rPr>
+        <w:rFonts w:ascii="Wingdings" w:hAnsi="Wingdings" w:hint="default"/>
+        <w:sz w:val="20"/>
+      </w:rPr>
+    </w:lvl>
+    <w:lvl w:ilvl="4" w:tentative="1">
+      <w:start w:val="1"/>
+      <w:numFmt w:val="bullet"/>
+      <w:lvlText w:val=""/>
+      <w:lvlJc w:val="left"/>
+      <w:pPr>
+        <w:tabs>
+          <w:tab w:val="num" w:pos="3600"/>
+        </w:tabs>
+        <w:ind w:left="3600" w:hanging="360"/>
+      </w:pPr>
+      <w:rPr>
+        <w:rFonts w:ascii="Wingdings" w:hAnsi="Wingdings" w:hint="default"/>
+        <w:sz w:val="20"/>
+      </w:rPr>
+    </w:lvl>
+    <w:lvl w:ilvl="5" w:tentative="1">
+      <w:start w:val="1"/>
+      <w:numFmt w:val="bullet"/>
+      <w:lvlText w:val=""/>
+      <w:lvlJc w:val="left"/>
+      <w:pPr>
+        <w:tabs>
+          <w:tab w:val="num" w:pos="4320"/>
+        </w:tabs>
+        <w:ind w:left="4320" w:hanging="360"/>
+      </w:pPr>
+      <w:rPr>
+        <w:rFonts w:ascii="Wingdings" w:hAnsi="Wingdings" w:hint="default"/>
+        <w:sz w:val="20"/>
+      </w:rPr>
+    </w:lvl>
+    <w:lvl w:ilvl="6" w:tentative="1">
+      <w:start w:val="1"/>
+      <w:numFmt w:val="bullet"/>
+      <w:lvlText w:val=""/>
+      <w:lvlJc w:val="left"/>
+      <w:pPr>
+        <w:tabs>
+          <w:tab w:val="num" w:pos="5040"/>
+        </w:tabs>
+        <w:ind w:left="5040" w:hanging="360"/>
+      </w:pPr>
+      <w:rPr>
+        <w:rFonts w:ascii="Wingdings" w:hAnsi="Wingdings" w:hint="default"/>
+        <w:sz w:val="20"/>
+      </w:rPr>
+    </w:lvl>
+    <w:lvl w:ilvl="7" w:tentative="1">
+      <w:start w:val="1"/>
+      <w:numFmt w:val="bullet"/>
+      <w:lvlText w:val=""/>
+      <w:lvlJc w:val="left"/>
+      <w:pPr>
+        <w:tabs>
+          <w:tab w:val="num" w:pos="5760"/>
+        </w:tabs>
+        <w:ind w:left="5760" w:hanging="360"/>
+      </w:pPr>
+      <w:rPr>
+        <w:rFonts w:ascii="Wingdings" w:hAnsi="Wingdings" w:hint="default"/>
+        <w:sz w:val="20"/>
+      </w:rPr>
+    </w:lvl>
+    <w:lvl w:ilvl="8" w:tentative="1">
+      <w:start w:val="1"/>
+      <w:numFmt w:val="bullet"/>
+      <w:lvlText w:val=""/>
+      <w:lvlJc w:val="left"/>
+      <w:pPr>
+        <w:tabs>
+          <w:tab w:val="num" w:pos="6480"/>
+        </w:tabs>
+        <w:ind w:left="6480" w:hanging="360"/>
+      </w:pPr>
+      <w:rPr>
+        <w:rFonts w:ascii="Wingdings" w:hAnsi="Wingdings" w:hint="default"/>
+        <w:sz w:val="20"/>
+      </w:rPr>
+    </w:lvl>
+  </w:abstractNum>
+  <w:abstractNum w:abstractNumId="11" w15:restartNumberingAfterBreak="0">
     <w:nsid w:val="3DA17CC4"/>
     <w:multiLevelType w:val="multilevel"/>
     <w:tmpl w:val="96D26FC8"/>
@@ -1547,7 +2845,7 @@
       </w:rPr>
     </w:lvl>
   </w:abstractNum>
-  <w:abstractNum w:abstractNumId="6" w15:restartNumberingAfterBreak="0">
+  <w:abstractNum w:abstractNumId="12" w15:restartNumberingAfterBreak="0">
     <w:nsid w:val="4F9C6C0E"/>
     <w:multiLevelType w:val="multilevel"/>
     <w:tmpl w:val="6B2E20FC"/>
@@ -1696,7 +2994,7 @@
       </w:rPr>
     </w:lvl>
   </w:abstractNum>
-  <w:abstractNum w:abstractNumId="7" w15:restartNumberingAfterBreak="0">
+  <w:abstractNum w:abstractNumId="13" w15:restartNumberingAfterBreak="0">
     <w:nsid w:val="57AC3B21"/>
     <w:multiLevelType w:val="multilevel"/>
     <w:tmpl w:val="64D26778"/>
@@ -1845,7 +3143,7 @@
       </w:rPr>
     </w:lvl>
   </w:abstractNum>
-  <w:abstractNum w:abstractNumId="8" w15:restartNumberingAfterBreak="0">
+  <w:abstractNum w:abstractNumId="14" w15:restartNumberingAfterBreak="0">
     <w:nsid w:val="598F003D"/>
     <w:multiLevelType w:val="multilevel"/>
     <w:tmpl w:val="9B20B9AE"/>
@@ -1994,7 +3292,7 @@
       </w:rPr>
     </w:lvl>
   </w:abstractNum>
-  <w:abstractNum w:abstractNumId="9" w15:restartNumberingAfterBreak="0">
+  <w:abstractNum w:abstractNumId="15" w15:restartNumberingAfterBreak="0">
     <w:nsid w:val="5BC7349D"/>
     <w:multiLevelType w:val="multilevel"/>
     <w:tmpl w:val="5912976C"/>
@@ -2143,7 +3441,7 @@
       </w:rPr>
     </w:lvl>
   </w:abstractNum>
-  <w:abstractNum w:abstractNumId="10" w15:restartNumberingAfterBreak="0">
+  <w:abstractNum w:abstractNumId="16" w15:restartNumberingAfterBreak="0">
     <w:nsid w:val="60C65870"/>
     <w:multiLevelType w:val="multilevel"/>
     <w:tmpl w:val="18083CF0"/>
@@ -2292,7 +3590,7 @@
       </w:rPr>
     </w:lvl>
   </w:abstractNum>
-  <w:abstractNum w:abstractNumId="11" w15:restartNumberingAfterBreak="0">
+  <w:abstractNum w:abstractNumId="17" w15:restartNumberingAfterBreak="0">
     <w:nsid w:val="615A7CF8"/>
     <w:multiLevelType w:val="multilevel"/>
     <w:tmpl w:val="2E1EC2B8"/>
@@ -2441,7 +3739,156 @@
       </w:rPr>
     </w:lvl>
   </w:abstractNum>
-  <w:abstractNum w:abstractNumId="12" w15:restartNumberingAfterBreak="0">
+  <w:abstractNum w:abstractNumId="18" w15:restartNumberingAfterBreak="0">
+    <w:nsid w:val="680724EF"/>
+    <w:multiLevelType w:val="multilevel"/>
+    <w:tmpl w:val="1DB4D32E"/>
+    <w:lvl w:ilvl="0">
+      <w:start w:val="1"/>
+      <w:numFmt w:val="bullet"/>
+      <w:lvlText w:val=""/>
+      <w:lvlJc w:val="left"/>
+      <w:pPr>
+        <w:tabs>
+          <w:tab w:val="num" w:pos="720"/>
+        </w:tabs>
+        <w:ind w:left="720" w:hanging="360"/>
+      </w:pPr>
+      <w:rPr>
+        <w:rFonts w:ascii="Symbol" w:hAnsi="Symbol" w:hint="default"/>
+        <w:sz w:val="20"/>
+      </w:rPr>
+    </w:lvl>
+    <w:lvl w:ilvl="1" w:tentative="1">
+      <w:start w:val="1"/>
+      <w:numFmt w:val="bullet"/>
+      <w:lvlText w:val="o"/>
+      <w:lvlJc w:val="left"/>
+      <w:pPr>
+        <w:tabs>
+          <w:tab w:val="num" w:pos="1440"/>
+        </w:tabs>
+        <w:ind w:left="1440" w:hanging="360"/>
+      </w:pPr>
+      <w:rPr>
+        <w:rFonts w:ascii="Courier New" w:hAnsi="Courier New" w:hint="default"/>
+        <w:sz w:val="20"/>
+      </w:rPr>
+    </w:lvl>
+    <w:lvl w:ilvl="2" w:tentative="1">
+      <w:start w:val="1"/>
+      <w:numFmt w:val="bullet"/>
+      <w:lvlText w:val=""/>
+      <w:lvlJc w:val="left"/>
+      <w:pPr>
+        <w:tabs>
+          <w:tab w:val="num" w:pos="2160"/>
+        </w:tabs>
+        <w:ind w:left="2160" w:hanging="360"/>
+      </w:pPr>
+      <w:rPr>
+        <w:rFonts w:ascii="Wingdings" w:hAnsi="Wingdings" w:hint="default"/>
+        <w:sz w:val="20"/>
+      </w:rPr>
+    </w:lvl>
+    <w:lvl w:ilvl="3" w:tentative="1">
+      <w:start w:val="1"/>
+      <w:numFmt w:val="bullet"/>
+      <w:lvlText w:val=""/>
+      <w:lvlJc w:val="left"/>
+      <w:pPr>
+        <w:tabs>
+          <w:tab w:val="num" w:pos="2880"/>
+        </w:tabs>
+        <w:ind w:left="2880" w:hanging="360"/>
+      </w:pPr>
+      <w:rPr>
+        <w:rFonts w:ascii="Wingdings" w:hAnsi="Wingdings" w:hint="default"/>
+        <w:sz w:val="20"/>
+      </w:rPr>
+    </w:lvl>
+    <w:lvl w:ilvl="4" w:tentative="1">
+      <w:start w:val="1"/>
+      <w:numFmt w:val="bullet"/>
+      <w:lvlText w:val=""/>
+      <w:lvlJc w:val="left"/>
+      <w:pPr>
+        <w:tabs>
+          <w:tab w:val="num" w:pos="3600"/>
+        </w:tabs>
+        <w:ind w:left="3600" w:hanging="360"/>
+      </w:pPr>
+      <w:rPr>
+        <w:rFonts w:ascii="Wingdings" w:hAnsi="Wingdings" w:hint="default"/>
+        <w:sz w:val="20"/>
+      </w:rPr>
+    </w:lvl>
+    <w:lvl w:ilvl="5" w:tentative="1">
+      <w:start w:val="1"/>
+      <w:numFmt w:val="bullet"/>
+      <w:lvlText w:val=""/>
+      <w:lvlJc w:val="left"/>
+      <w:pPr>
+        <w:tabs>
+          <w:tab w:val="num" w:pos="4320"/>
+        </w:tabs>
+        <w:ind w:left="4320" w:hanging="360"/>
+      </w:pPr>
+      <w:rPr>
+        <w:rFonts w:ascii="Wingdings" w:hAnsi="Wingdings" w:hint="default"/>
+        <w:sz w:val="20"/>
+      </w:rPr>
+    </w:lvl>
+    <w:lvl w:ilvl="6" w:tentative="1">
+      <w:start w:val="1"/>
+      <w:numFmt w:val="bullet"/>
+      <w:lvlText w:val=""/>
+      <w:lvlJc w:val="left"/>
+      <w:pPr>
+        <w:tabs>
+          <w:tab w:val="num" w:pos="5040"/>
+        </w:tabs>
+        <w:ind w:left="5040" w:hanging="360"/>
+      </w:pPr>
+      <w:rPr>
+        <w:rFonts w:ascii="Wingdings" w:hAnsi="Wingdings" w:hint="default"/>
+        <w:sz w:val="20"/>
+      </w:rPr>
+    </w:lvl>
+    <w:lvl w:ilvl="7" w:tentative="1">
+      <w:start w:val="1"/>
+      <w:numFmt w:val="bullet"/>
+      <w:lvlText w:val=""/>
+      <w:lvlJc w:val="left"/>
+      <w:pPr>
+        <w:tabs>
+          <w:tab w:val="num" w:pos="5760"/>
+        </w:tabs>
+        <w:ind w:left="5760" w:hanging="360"/>
+      </w:pPr>
+      <w:rPr>
+        <w:rFonts w:ascii="Wingdings" w:hAnsi="Wingdings" w:hint="default"/>
+        <w:sz w:val="20"/>
+      </w:rPr>
+    </w:lvl>
+    <w:lvl w:ilvl="8" w:tentative="1">
+      <w:start w:val="1"/>
+      <w:numFmt w:val="bullet"/>
+      <w:lvlText w:val=""/>
+      <w:lvlJc w:val="left"/>
+      <w:pPr>
+        <w:tabs>
+          <w:tab w:val="num" w:pos="6480"/>
+        </w:tabs>
+        <w:ind w:left="6480" w:hanging="360"/>
+      </w:pPr>
+      <w:rPr>
+        <w:rFonts w:ascii="Wingdings" w:hAnsi="Wingdings" w:hint="default"/>
+        <w:sz w:val="20"/>
+      </w:rPr>
+    </w:lvl>
+  </w:abstractNum>
+  <w:abstractNum w:abstractNumId="19" w15:restartNumberingAfterBreak="0">
     <w:nsid w:val="68F84BCC"/>
     <w:multiLevelType w:val="multilevel"/>
     <w:tmpl w:val="41DADE2E"/>
@@ -2590,7 +4037,7 @@
       </w:rPr>
     </w:lvl>
   </w:abstractNum>
-  <w:abstractNum w:abstractNumId="13" w15:restartNumberingAfterBreak="0">
+  <w:abstractNum w:abstractNumId="20" w15:restartNumberingAfterBreak="0">
     <w:nsid w:val="71C90ECD"/>
     <w:multiLevelType w:val="multilevel"/>
     <w:tmpl w:val="16F6553C"/>
@@ -2740,46 +4187,67 @@
     </w:lvl>
   </w:abstractNum>
   <w:num w:numId="1">
+    <w:abstractNumId w:val="19"/>
+  </w:num>
+  <w:num w:numId="2">
+    <w:abstractNumId w:val="7"/>
+  </w:num>
+  <w:num w:numId="3">
+    <w:abstractNumId w:val="11"/>
+  </w:num>
+  <w:num w:numId="4">
+    <w:abstractNumId w:val="15"/>
+  </w:num>
+  <w:num w:numId="5">
+    <w:abstractNumId w:val="14"/>
+  </w:num>
+  <w:num w:numId="6">
+    <w:abstractNumId w:val="20"/>
+  </w:num>
+  <w:num w:numId="7">
+    <w:abstractNumId w:val="9"/>
+  </w:num>
+  <w:num w:numId="8">
     <w:abstractNumId w:val="12"/>
   </w:num>
-  <w:num w:numId="2">
-    <w:abstractNumId w:val="3"/>
+  <w:num w:numId="9">
+    <w:abstractNumId w:val="17"/>
   </w:num>
-  <w:num w:numId="3">
+  <w:num w:numId="10">
+    <w:abstractNumId w:val="16"/>
+  </w:num>
+  <w:num w:numId="11">
     <w:abstractNumId w:val="5"/>
   </w:num>
-  <w:num w:numId="4">
-    <w:abstractNumId w:val="9"/>
-  </w:num>
-  <w:num w:numId="5">
-    <w:abstractNumId w:val="8"/>
-  </w:num>
-  <w:num w:numId="6">
+  <w:num w:numId="12">
     <w:abstractNumId w:val="13"/>
-  </w:num>
-  <w:num w:numId="7">
-    <w:abstractNumId w:val="4"/>
-  </w:num>
-  <w:num w:numId="8">
-    <w:abstractNumId w:val="6"/>
-  </w:num>
-  <w:num w:numId="9">
-    <w:abstractNumId w:val="11"/>
-  </w:num>
-  <w:num w:numId="10">
-    <w:abstractNumId w:val="10"/>
-  </w:num>
-  <w:num w:numId="11">
-    <w:abstractNumId w:val="2"/>
-  </w:num>
-  <w:num w:numId="12">
-    <w:abstractNumId w:val="7"/>
   </w:num>
   <w:num w:numId="13">
     <w:abstractNumId w:val="0"/>
   </w:num>
   <w:num w:numId="14">
     <w:abstractNumId w:val="1"/>
+  </w:num>
+  <w:num w:numId="15">
+    <w:abstractNumId w:val="8"/>
+  </w:num>
+  <w:num w:numId="16">
+    <w:abstractNumId w:val="10"/>
+  </w:num>
+  <w:num w:numId="17">
+    <w:abstractNumId w:val="2"/>
+  </w:num>
+  <w:num w:numId="18">
+    <w:abstractNumId w:val="3"/>
+  </w:num>
+  <w:num w:numId="19">
+    <w:abstractNumId w:val="4"/>
+  </w:num>
+  <w:num w:numId="20">
+    <w:abstractNumId w:val="18"/>
+  </w:num>
+  <w:num w:numId="21">
+    <w:abstractNumId w:val="6"/>
   </w:num>
 </w:numbering>
 </file>
@@ -3406,6 +4874,18 @@
       <w:iCs/>
     </w:rPr>
   </w:style>
+  <w:style w:type="character" w:styleId="FollowedHyperlink">
+    <w:name w:val="FollowedHyperlink"/>
+    <w:basedOn w:val="DefaultParagraphFont"/>
+    <w:uiPriority w:val="99"/>
+    <w:semiHidden/>
+    <w:unhideWhenUsed/>
+    <w:rsid w:val="0031257A"/>
+    <w:rPr>
+      <w:color w:val="954F72" w:themeColor="followedHyperlink"/>
+      <w:u w:val="single"/>
+    </w:rPr>
+  </w:style>
 </w:styles>
 </file>
 

</xml_diff>